<commit_message>
docs: update project report to reflect collaborative pair engineering by Swarup Linge and partner
</commit_message>
<xml_diff>
--- a/DSA_Spotify_Project_Report.docx
+++ b/DSA_Spotify_Project_Report.docx
@@ -84,7 +84,7 @@
     </w:p>
     <w:p>
       <w:pPr>
-        <w:spacing w:after="480" w:before="60"/>
+        <w:spacing w:after="400" w:before="60"/>
         <w:jc w:val="center"/>
       </w:pPr>
       <w:r>
@@ -95,6 +95,23 @@
           <w:szCs w:val="24"/>
         </w:rPr>
         <w:t xml:space="preserve">A Full-Stack Music Platform Engineered with 8 Custom Data Structures &amp; Algorithmic Paradigms</w:t>
+      </w:r>
+    </w:p>
+    <w:p>
+      <w:pPr>
+        <w:spacing w:after="360" w:before="0"/>
+        <w:jc w:val="center"/>
+      </w:pPr>
+      <w:r>
+        <w:rPr>
+          <w:rFonts w:ascii="Arial" w:cs="Arial" w:eastAsia="Arial" w:hAnsi="Arial"/>
+          <w:b/>
+          <w:bCs/>
+          <w:color w:val="15803D"/>
+          <w:sz w:val="20"/>
+          <w:szCs w:val="20"/>
+        </w:rPr>
+        <w:t xml:space="preserve">[ Collaborative Pair Engineering Project — Team of 2 Candidates ]</w:t>
       </w:r>
     </w:p>
     <w:tbl>
@@ -110,13 +127,13 @@
         </w:tblBorders>
       </w:tblPr>
       <w:tblGrid>
-        <w:gridCol w:w="3361"/>
-        <w:gridCol w:w="6241"/>
+        <w:gridCol w:w="3073"/>
+        <w:gridCol w:w="6529"/>
       </w:tblGrid>
       <w:tr>
         <w:tc>
           <w:tcPr>
-            <w:tcW w:type="pct" w:w="1750"/>
+            <w:tcW w:type="pct" w:w="1600"/>
             <w:gridSpan w:val="1"/>
             <w:tcBorders>
               <w:top w:val="single" w:color="CBD5E1" w:sz="1"/>
@@ -152,7 +169,7 @@
         </w:tc>
         <w:tc>
           <w:tcPr>
-            <w:tcW w:type="pct" w:w="3250"/>
+            <w:tcW w:type="pct" w:w="3400"/>
             <w:gridSpan w:val="1"/>
             <w:tcBorders>
               <w:top w:val="single" w:color="CBD5E1" w:sz="1"/>
@@ -219,42 +236,42 @@
                 <w:sz w:val="19"/>
                 <w:szCs w:val="19"/>
               </w:rPr>
-              <w:t xml:space="preserve">Candidate Name</w:t>
-            </w:r>
-          </w:p>
-        </w:tc>
-        <w:tc>
-          <w:tcPr>
-            <w:gridSpan w:val="1"/>
-            <w:tcBorders>
-              <w:top w:val="single" w:color="CBD5E1" w:sz="1"/>
-              <w:left w:val="single" w:color="CBD5E1" w:sz="1"/>
-              <w:bottom w:val="single" w:color="CBD5E1" w:sz="1"/>
-              <w:right w:val="single" w:color="CBD5E1" w:sz="1"/>
-            </w:tcBorders>
-            <w:shd w:fill="FFFFFF" w:val="clear"/>
-            <w:tcMar>
-              <w:top w:type="dxa" w:w="100"/>
-              <w:left w:type="dxa" w:w="140"/>
-              <w:bottom w:type="dxa" w:w="100"/>
-              <w:right w:type="dxa" w:w="140"/>
-            </w:tcMar>
-          </w:tcPr>
-          <w:p>
-            <w:pPr>
-              <w:spacing w:after="60" w:before="60"/>
-              <w:jc w:val="left"/>
-            </w:pPr>
-            <w:r>
-              <w:rPr>
-                <w:rFonts w:ascii="Arial" w:cs="Arial" w:eastAsia="Arial" w:hAnsi="Arial"/>
-                <w:b/>
-                <w:bCs/>
-                <w:color w:val="0F172A"/>
-                <w:sz w:val="19"/>
-                <w:szCs w:val="19"/>
-              </w:rPr>
-              <w:t xml:space="preserve">Swarup Linge</w:t>
+              <w:t xml:space="preserve">Project Title</w:t>
+            </w:r>
+          </w:p>
+        </w:tc>
+        <w:tc>
+          <w:tcPr>
+            <w:gridSpan w:val="1"/>
+            <w:tcBorders>
+              <w:top w:val="single" w:color="CBD5E1" w:sz="1"/>
+              <w:left w:val="single" w:color="CBD5E1" w:sz="1"/>
+              <w:bottom w:val="single" w:color="CBD5E1" w:sz="1"/>
+              <w:right w:val="single" w:color="CBD5E1" w:sz="1"/>
+            </w:tcBorders>
+            <w:shd w:fill="FFFFFF" w:val="clear"/>
+            <w:tcMar>
+              <w:top w:type="dxa" w:w="100"/>
+              <w:left w:type="dxa" w:w="140"/>
+              <w:bottom w:type="dxa" w:w="100"/>
+              <w:right w:type="dxa" w:w="140"/>
+            </w:tcMar>
+          </w:tcPr>
+          <w:p>
+            <w:pPr>
+              <w:spacing w:after="60" w:before="60"/>
+              <w:jc w:val="left"/>
+            </w:pPr>
+            <w:r>
+              <w:rPr>
+                <w:rFonts w:ascii="Arial" w:cs="Arial" w:eastAsia="Arial" w:hAnsi="Arial"/>
+                <w:b/>
+                <w:bCs/>
+                <w:color w:val="334155"/>
+                <w:sz w:val="19"/>
+                <w:szCs w:val="19"/>
+              </w:rPr>
+              <w:t xml:space="preserve">RHYTHM BOX: Algorithmic Audio Platform &amp; DSA Showcase</w:t>
             </w:r>
           </w:p>
         </w:tc>
@@ -291,42 +308,43 @@
                 <w:sz w:val="19"/>
                 <w:szCs w:val="19"/>
               </w:rPr>
-              <w:t xml:space="preserve">Roll Number</w:t>
-            </w:r>
-          </w:p>
-        </w:tc>
-        <w:tc>
-          <w:tcPr>
-            <w:gridSpan w:val="1"/>
-            <w:tcBorders>
-              <w:top w:val="single" w:color="CBD5E1" w:sz="1"/>
-              <w:left w:val="single" w:color="CBD5E1" w:sz="1"/>
-              <w:bottom w:val="single" w:color="CBD5E1" w:sz="1"/>
-              <w:right w:val="single" w:color="CBD5E1" w:sz="1"/>
-            </w:tcBorders>
-            <w:shd w:fill="FFFFFF" w:val="clear"/>
-            <w:tcMar>
-              <w:top w:type="dxa" w:w="100"/>
-              <w:left w:type="dxa" w:w="140"/>
-              <w:bottom w:type="dxa" w:w="100"/>
-              <w:right w:type="dxa" w:w="140"/>
-            </w:tcMar>
-          </w:tcPr>
-          <w:p>
-            <w:pPr>
-              <w:spacing w:after="60" w:before="60"/>
-              <w:jc w:val="left"/>
-            </w:pPr>
-            <w:r>
-              <w:rPr>
-                <w:rFonts w:ascii="Arial" w:cs="Arial" w:eastAsia="Arial" w:hAnsi="Arial"/>
-                <w:b/>
-                <w:bCs/>
-                <w:color w:val="334155"/>
-                <w:sz w:val="19"/>
-                <w:szCs w:val="19"/>
-              </w:rPr>
-              <w:t xml:space="preserve">24</w:t>
+              <w:t xml:space="preserve">Candidate 1 (Team Member)</w:t>
+            </w:r>
+          </w:p>
+        </w:tc>
+        <w:tc>
+          <w:tcPr>
+            <w:gridSpan w:val="1"/>
+            <w:tcBorders>
+              <w:top w:val="single" w:color="CBD5E1" w:sz="1"/>
+              <w:left w:val="single" w:color="CBD5E1" w:sz="1"/>
+              <w:bottom w:val="single" w:color="CBD5E1" w:sz="1"/>
+              <w:right w:val="single" w:color="CBD5E1" w:sz="1"/>
+            </w:tcBorders>
+            <w:shd w:fill="FFFFFF" w:val="clear"/>
+            <w:tcMar>
+              <w:top w:type="dxa" w:w="100"/>
+              <w:left w:type="dxa" w:w="140"/>
+              <w:bottom w:type="dxa" w:w="100"/>
+              <w:right w:type="dxa" w:w="140"/>
+            </w:tcMar>
+          </w:tcPr>
+          <w:p>
+            <w:pPr>
+              <w:spacing w:after="60" w:before="60"/>
+              <w:jc w:val="left"/>
+            </w:pPr>
+            <w:r>
+              <w:rPr>
+                <w:rFonts w:ascii="Arial" w:cs="Arial" w:eastAsia="Arial" w:hAnsi="Arial"/>
+                <w:b/>
+                <w:bCs/>
+                <w:color w:val="0F172A"/>
+                <w:sz w:val="19"/>
+                <w:szCs w:val="19"/>
+              </w:rPr>
+              <w:t xml:space="preserve">Swarup Linge
+Roll Number: 24 | SAP ID: 70012023001</w:t>
             </w:r>
           </w:p>
         </w:tc>
@@ -363,42 +381,43 @@
                 <w:sz w:val="19"/>
                 <w:szCs w:val="19"/>
               </w:rPr>
-              <w:t xml:space="preserve">SAP ID</w:t>
-            </w:r>
-          </w:p>
-        </w:tc>
-        <w:tc>
-          <w:tcPr>
-            <w:gridSpan w:val="1"/>
-            <w:tcBorders>
-              <w:top w:val="single" w:color="CBD5E1" w:sz="1"/>
-              <w:left w:val="single" w:color="CBD5E1" w:sz="1"/>
-              <w:bottom w:val="single" w:color="CBD5E1" w:sz="1"/>
-              <w:right w:val="single" w:color="CBD5E1" w:sz="1"/>
-            </w:tcBorders>
-            <w:shd w:fill="FFFFFF" w:val="clear"/>
-            <w:tcMar>
-              <w:top w:type="dxa" w:w="100"/>
-              <w:left w:type="dxa" w:w="140"/>
-              <w:bottom w:type="dxa" w:w="100"/>
-              <w:right w:type="dxa" w:w="140"/>
-            </w:tcMar>
-          </w:tcPr>
-          <w:p>
-            <w:pPr>
-              <w:spacing w:after="60" w:before="60"/>
-              <w:jc w:val="left"/>
-            </w:pPr>
-            <w:r>
-              <w:rPr>
-                <w:rFonts w:ascii="Arial" w:cs="Arial" w:eastAsia="Arial" w:hAnsi="Arial"/>
-                <w:b/>
-                <w:bCs/>
-                <w:color w:val="334155"/>
-                <w:sz w:val="19"/>
-                <w:szCs w:val="19"/>
-              </w:rPr>
-              <w:t xml:space="preserve">70012023001</w:t>
+              <w:t xml:space="preserve">Candidate 2 (Team Member &amp; Co-Author)</w:t>
+            </w:r>
+          </w:p>
+        </w:tc>
+        <w:tc>
+          <w:tcPr>
+            <w:gridSpan w:val="1"/>
+            <w:tcBorders>
+              <w:top w:val="single" w:color="CBD5E1" w:sz="1"/>
+              <w:left w:val="single" w:color="CBD5E1" w:sz="1"/>
+              <w:bottom w:val="single" w:color="CBD5E1" w:sz="1"/>
+              <w:right w:val="single" w:color="CBD5E1" w:sz="1"/>
+            </w:tcBorders>
+            <w:shd w:fill="FFFFFF" w:val="clear"/>
+            <w:tcMar>
+              <w:top w:type="dxa" w:w="100"/>
+              <w:left w:type="dxa" w:w="140"/>
+              <w:bottom w:type="dxa" w:w="100"/>
+              <w:right w:type="dxa" w:w="140"/>
+            </w:tcMar>
+          </w:tcPr>
+          <w:p>
+            <w:pPr>
+              <w:spacing w:after="60" w:before="60"/>
+              <w:jc w:val="left"/>
+            </w:pPr>
+            <w:r>
+              <w:rPr>
+                <w:rFonts w:ascii="Arial" w:cs="Arial" w:eastAsia="Arial" w:hAnsi="Arial"/>
+                <w:b/>
+                <w:bCs/>
+                <w:color w:val="0F172A"/>
+                <w:sz w:val="19"/>
+                <w:szCs w:val="19"/>
+              </w:rPr>
+              <w:t xml:space="preserve">[Project Partner / Co-Developer Name]
+Roll Number: [Partner Roll No.] | SAP ID: [Partner SAP ID]</w:t>
             </w:r>
           </w:p>
         </w:tc>
@@ -542,7 +561,7 @@
                 <w:sz w:val="19"/>
                 <w:szCs w:val="19"/>
               </w:rPr>
-              <w:t xml:space="preserve">Computer Science &amp; Engineering</w:t>
+              <w:t xml:space="preserve">Department of Computer Science &amp; Engineering</w:t>
             </w:r>
           </w:p>
         </w:tc>
@@ -579,42 +598,42 @@
                 <w:sz w:val="19"/>
                 <w:szCs w:val="19"/>
               </w:rPr>
-              <w:t xml:space="preserve">Submission Date</w:t>
-            </w:r>
-          </w:p>
-        </w:tc>
-        <w:tc>
-          <w:tcPr>
-            <w:gridSpan w:val="1"/>
-            <w:tcBorders>
-              <w:top w:val="single" w:color="CBD5E1" w:sz="1"/>
-              <w:left w:val="single" w:color="CBD5E1" w:sz="1"/>
-              <w:bottom w:val="single" w:color="CBD5E1" w:sz="1"/>
-              <w:right w:val="single" w:color="CBD5E1" w:sz="1"/>
-            </w:tcBorders>
-            <w:shd w:fill="FFFFFF" w:val="clear"/>
-            <w:tcMar>
-              <w:top w:type="dxa" w:w="100"/>
-              <w:left w:type="dxa" w:w="140"/>
-              <w:bottom w:type="dxa" w:w="100"/>
-              <w:right w:type="dxa" w:w="140"/>
-            </w:tcMar>
-          </w:tcPr>
-          <w:p>
-            <w:pPr>
-              <w:spacing w:after="60" w:before="60"/>
-              <w:jc w:val="left"/>
-            </w:pPr>
-            <w:r>
-              <w:rPr>
-                <w:rFonts w:ascii="Arial" w:cs="Arial" w:eastAsia="Arial" w:hAnsi="Arial"/>
-                <w:b w:val="false"/>
-                <w:bCs w:val="false"/>
-                <w:color w:val="334155"/>
-                <w:sz w:val="19"/>
-                <w:szCs w:val="19"/>
-              </w:rPr>
-              <w:t xml:space="preserve">September 30, 2026</w:t>
+              <w:t xml:space="preserve">Academic Year &amp; Date</w:t>
+            </w:r>
+          </w:p>
+        </w:tc>
+        <w:tc>
+          <w:tcPr>
+            <w:gridSpan w:val="1"/>
+            <w:tcBorders>
+              <w:top w:val="single" w:color="CBD5E1" w:sz="1"/>
+              <w:left w:val="single" w:color="CBD5E1" w:sz="1"/>
+              <w:bottom w:val="single" w:color="CBD5E1" w:sz="1"/>
+              <w:right w:val="single" w:color="CBD5E1" w:sz="1"/>
+            </w:tcBorders>
+            <w:shd w:fill="FFFFFF" w:val="clear"/>
+            <w:tcMar>
+              <w:top w:type="dxa" w:w="100"/>
+              <w:left w:type="dxa" w:w="140"/>
+              <w:bottom w:type="dxa" w:w="100"/>
+              <w:right w:type="dxa" w:w="140"/>
+            </w:tcMar>
+          </w:tcPr>
+          <w:p>
+            <w:pPr>
+              <w:spacing w:after="60" w:before="60"/>
+              <w:jc w:val="left"/>
+            </w:pPr>
+            <w:r>
+              <w:rPr>
+                <w:rFonts w:ascii="Arial" w:cs="Arial" w:eastAsia="Arial" w:hAnsi="Arial"/>
+                <w:b w:val="false"/>
+                <w:bCs w:val="false"/>
+                <w:color w:val="334155"/>
+                <w:sz w:val="19"/>
+                <w:szCs w:val="19"/>
+              </w:rPr>
+              <w:t xml:space="preserve">Academic Year 2026-2027 | Submission Date: September 30, 2026</w:t>
             </w:r>
           </w:p>
         </w:tc>
@@ -839,7 +858,7 @@
     </w:tbl>
     <w:p>
       <w:pPr>
-        <w:spacing w:after="120" w:before="360"/>
+        <w:spacing w:after="120" w:before="300"/>
       </w:pPr>
       <w:r>
         <w:rPr>
@@ -849,7 +868,271 @@
           <w:sz w:val="22"/>
           <w:szCs w:val="22"/>
         </w:rPr>
-        <w:t xml:space="preserve">Project Abstract &amp; Declaration:</w:t>
+        <w:t xml:space="preserve">Team Collaboration &amp; Responsibility Matrix:</w:t>
+      </w:r>
+    </w:p>
+    <w:tbl>
+      <w:tblPr>
+        <w:tblW w:type="pct" w:w="5000"/>
+        <w:tblBorders>
+          <w:top w:val="single" w:color="auto" w:sz="4"/>
+          <w:left w:val="single" w:color="auto" w:sz="4"/>
+          <w:bottom w:val="single" w:color="auto" w:sz="4"/>
+          <w:right w:val="single" w:color="auto" w:sz="4"/>
+          <w:insideH w:val="single" w:color="auto" w:sz="4"/>
+          <w:insideV w:val="single" w:color="auto" w:sz="4"/>
+        </w:tblBorders>
+      </w:tblPr>
+      <w:tblGrid>
+        <w:gridCol w:w="2881"/>
+        <w:gridCol w:w="6721"/>
+      </w:tblGrid>
+      <w:tr>
+        <w:tc>
+          <w:tcPr>
+            <w:tcW w:type="pct" w:w="1500"/>
+            <w:gridSpan w:val="1"/>
+            <w:tcBorders>
+              <w:top w:val="single" w:color="CBD5E1" w:sz="1"/>
+              <w:left w:val="single" w:color="CBD5E1" w:sz="1"/>
+              <w:bottom w:val="single" w:color="CBD5E1" w:sz="1"/>
+              <w:right w:val="single" w:color="CBD5E1" w:sz="1"/>
+            </w:tcBorders>
+            <w:shd w:fill="1E293B" w:val="clear"/>
+            <w:tcMar>
+              <w:top w:type="dxa" w:w="100"/>
+              <w:left w:type="dxa" w:w="140"/>
+              <w:bottom w:type="dxa" w:w="100"/>
+              <w:right w:type="dxa" w:w="140"/>
+            </w:tcMar>
+          </w:tcPr>
+          <w:p>
+            <w:pPr>
+              <w:spacing w:after="60" w:before="60"/>
+              <w:jc w:val="left"/>
+            </w:pPr>
+            <w:r>
+              <w:rPr>
+                <w:rFonts w:ascii="Arial" w:cs="Arial" w:eastAsia="Arial" w:hAnsi="Arial"/>
+                <w:b/>
+                <w:bCs/>
+                <w:color w:val="FFFFFF"/>
+                <w:sz w:val="19"/>
+                <w:szCs w:val="19"/>
+              </w:rPr>
+              <w:t xml:space="preserve">Team Member</w:t>
+            </w:r>
+          </w:p>
+        </w:tc>
+        <w:tc>
+          <w:tcPr>
+            <w:tcW w:type="pct" w:w="3500"/>
+            <w:gridSpan w:val="1"/>
+            <w:tcBorders>
+              <w:top w:val="single" w:color="CBD5E1" w:sz="1"/>
+              <w:left w:val="single" w:color="CBD5E1" w:sz="1"/>
+              <w:bottom w:val="single" w:color="CBD5E1" w:sz="1"/>
+              <w:right w:val="single" w:color="CBD5E1" w:sz="1"/>
+            </w:tcBorders>
+            <w:shd w:fill="1E293B" w:val="clear"/>
+            <w:tcMar>
+              <w:top w:type="dxa" w:w="100"/>
+              <w:left w:type="dxa" w:w="140"/>
+              <w:bottom w:type="dxa" w:w="100"/>
+              <w:right w:type="dxa" w:w="140"/>
+            </w:tcMar>
+          </w:tcPr>
+          <w:p>
+            <w:pPr>
+              <w:spacing w:after="60" w:before="60"/>
+              <w:jc w:val="left"/>
+            </w:pPr>
+            <w:r>
+              <w:rPr>
+                <w:rFonts w:ascii="Arial" w:cs="Arial" w:eastAsia="Arial" w:hAnsi="Arial"/>
+                <w:b/>
+                <w:bCs/>
+                <w:color w:val="FFFFFF"/>
+                <w:sz w:val="19"/>
+                <w:szCs w:val="19"/>
+              </w:rPr>
+              <w:t xml:space="preserve">Primary DSA Architecture Modules &amp; Engineering Responsibilities</w:t>
+            </w:r>
+          </w:p>
+        </w:tc>
+      </w:tr>
+      <w:tr>
+        <w:tc>
+          <w:tcPr>
+            <w:gridSpan w:val="1"/>
+            <w:tcBorders>
+              <w:top w:val="single" w:color="CBD5E1" w:sz="1"/>
+              <w:left w:val="single" w:color="CBD5E1" w:sz="1"/>
+              <w:bottom w:val="single" w:color="CBD5E1" w:sz="1"/>
+              <w:right w:val="single" w:color="CBD5E1" w:sz="1"/>
+            </w:tcBorders>
+            <w:shd w:fill="F8FAFC" w:val="clear"/>
+            <w:tcMar>
+              <w:top w:type="dxa" w:w="100"/>
+              <w:left w:type="dxa" w:w="140"/>
+              <w:bottom w:type="dxa" w:w="100"/>
+              <w:right w:type="dxa" w:w="140"/>
+            </w:tcMar>
+          </w:tcPr>
+          <w:p>
+            <w:pPr>
+              <w:spacing w:after="60" w:before="60"/>
+              <w:jc w:val="left"/>
+            </w:pPr>
+            <w:r>
+              <w:rPr>
+                <w:rFonts w:ascii="Arial" w:cs="Arial" w:eastAsia="Arial" w:hAnsi="Arial"/>
+                <w:b/>
+                <w:bCs/>
+                <w:color w:val="334155"/>
+                <w:sz w:val="19"/>
+                <w:szCs w:val="19"/>
+              </w:rPr>
+              <w:t xml:space="preserve">Candidate 1:
+Swarup Linge
+(Roll: 24 | SAP: 70012023001)</w:t>
+            </w:r>
+          </w:p>
+        </w:tc>
+        <w:tc>
+          <w:tcPr>
+            <w:gridSpan w:val="1"/>
+            <w:tcBorders>
+              <w:top w:val="single" w:color="CBD5E1" w:sz="1"/>
+              <w:left w:val="single" w:color="CBD5E1" w:sz="1"/>
+              <w:bottom w:val="single" w:color="CBD5E1" w:sz="1"/>
+              <w:right w:val="single" w:color="CBD5E1" w:sz="1"/>
+            </w:tcBorders>
+            <w:shd w:fill="FFFFFF" w:val="clear"/>
+            <w:tcMar>
+              <w:top w:type="dxa" w:w="100"/>
+              <w:left w:type="dxa" w:w="140"/>
+              <w:bottom w:type="dxa" w:w="100"/>
+              <w:right w:type="dxa" w:w="140"/>
+            </w:tcMar>
+          </w:tcPr>
+          <w:p>
+            <w:pPr>
+              <w:spacing w:after="60" w:before="60"/>
+              <w:jc w:val="left"/>
+            </w:pPr>
+            <w:r>
+              <w:rPr>
+                <w:rFonts w:ascii="Arial" w:cs="Arial" w:eastAsia="Arial" w:hAnsi="Arial"/>
+                <w:b w:val="false"/>
+                <w:bCs w:val="false"/>
+                <w:color w:val="334155"/>
+                <w:sz w:val="19"/>
+                <w:szCs w:val="19"/>
+              </w:rPr>
+              <w:t xml:space="preserve">• Doubly Linked List Engine (O(1) next/prev pointer traversal &amp; DLL HUD)
+• FIFO Queue Buffer (O(1) Up Next scheduling with auto-dequeue on track end)
+• LIFO History &amp; Undo Engine (Command pattern with inverse stack operations)
+• Trie Prefix Search Tree (O(L) instant autocomplete with sub-millisecond query)
+• Audio Engine Integration (HTML5 direct playback &amp; local MP3 bundling)
+• Workstation UI Architecture &amp; React 19 MusicPlayerContext State Coordination</w:t>
+            </w:r>
+          </w:p>
+        </w:tc>
+      </w:tr>
+      <w:tr>
+        <w:tc>
+          <w:tcPr>
+            <w:gridSpan w:val="1"/>
+            <w:tcBorders>
+              <w:top w:val="single" w:color="CBD5E1" w:sz="1"/>
+              <w:left w:val="single" w:color="CBD5E1" w:sz="1"/>
+              <w:bottom w:val="single" w:color="CBD5E1" w:sz="1"/>
+              <w:right w:val="single" w:color="CBD5E1" w:sz="1"/>
+            </w:tcBorders>
+            <w:shd w:fill="FFFFFF" w:val="clear"/>
+            <w:tcMar>
+              <w:top w:type="dxa" w:w="100"/>
+              <w:left w:type="dxa" w:w="140"/>
+              <w:bottom w:type="dxa" w:w="100"/>
+              <w:right w:type="dxa" w:w="140"/>
+            </w:tcMar>
+          </w:tcPr>
+          <w:p>
+            <w:pPr>
+              <w:spacing w:after="60" w:before="60"/>
+              <w:jc w:val="left"/>
+            </w:pPr>
+            <w:r>
+              <w:rPr>
+                <w:rFonts w:ascii="Arial" w:cs="Arial" w:eastAsia="Arial" w:hAnsi="Arial"/>
+                <w:b/>
+                <w:bCs/>
+                <w:color w:val="334155"/>
+                <w:sz w:val="19"/>
+                <w:szCs w:val="19"/>
+              </w:rPr>
+              <w:t xml:space="preserve">Candidate 2:
+[Project Partner / Co-Developer]
+(Roll: [Partner Roll] | SAP: [Partner SAP])</w:t>
+            </w:r>
+          </w:p>
+        </w:tc>
+        <w:tc>
+          <w:tcPr>
+            <w:gridSpan w:val="1"/>
+            <w:tcBorders>
+              <w:top w:val="single" w:color="CBD5E1" w:sz="1"/>
+              <w:left w:val="single" w:color="CBD5E1" w:sz="1"/>
+              <w:bottom w:val="single" w:color="CBD5E1" w:sz="1"/>
+              <w:right w:val="single" w:color="CBD5E1" w:sz="1"/>
+            </w:tcBorders>
+            <w:shd w:fill="FFFFFF" w:val="clear"/>
+            <w:tcMar>
+              <w:top w:type="dxa" w:w="100"/>
+              <w:left w:type="dxa" w:w="140"/>
+              <w:bottom w:type="dxa" w:w="100"/>
+              <w:right w:type="dxa" w:w="140"/>
+            </w:tcMar>
+          </w:tcPr>
+          <w:p>
+            <w:pPr>
+              <w:spacing w:after="60" w:before="60"/>
+              <w:jc w:val="left"/>
+            </w:pPr>
+            <w:r>
+              <w:rPr>
+                <w:rFonts w:ascii="Arial" w:cs="Arial" w:eastAsia="Arial" w:hAnsi="Arial"/>
+                <w:b w:val="false"/>
+                <w:bCs w:val="false"/>
+                <w:color w:val="334155"/>
+                <w:sz w:val="19"/>
+                <w:szCs w:val="19"/>
+              </w:rPr>
+              <w:t xml:space="preserve">• Custom Hash Map Engine (djb2 hash function, prime-size table, separate chaining O(1) lookups)
+• Binary Max-Heap Priority Queue (playCount indexing, siftUp/siftDown invariants, Top 5 Charts)
+• Sorting Algorithms Suite (QuickSort Lomuto partition by Title &amp; MergeSort by Duration)
+• Graph &amp; BFS Recommendation Engine (Adjacency list similarity graph, 2-hop BFS traversal)
+• Interactive SVG Sonic Graph Canvas Visualizer Modal
+• Comprehensive SRS &amp; Test Case Execution Matrix (All 14 Test Cases verification)</w:t>
+            </w:r>
+          </w:p>
+        </w:tc>
+      </w:tr>
+    </w:tbl>
+    <w:p>
+      <w:pPr>
+        <w:spacing w:after="120" w:before="260"/>
+      </w:pPr>
+      <w:r>
+        <w:rPr>
+          <w:b/>
+          <w:bCs/>
+          <w:color w:val="0F172A"/>
+          <w:sz w:val="22"/>
+          <w:szCs w:val="22"/>
+        </w:rPr>
+        <w:t xml:space="preserve">Joint Academic Declaration:</w:t>
       </w:r>
     </w:p>
     <w:p>
@@ -866,7 +1149,7 @@
           <w:sz w:val="22"/>
           <w:szCs w:val="22"/>
         </w:rPr>
-        <w:t xml:space="preserve">I hereby declare that this project titled "Rhythm Box: Algorithmic Audio Platform &amp; DSA Showcase" has been designed, implemented, and tested independently by me as part of the CS-302 Data Structures and Algorithms curriculum. The application strictly rejects native array method shortcuts (such as Array.prototype.find, filter, sort, or slice) for all primary data operations, replacing them with custom zero-dependency implementations of Doubly Linked Lists, Queues, Stacks, Tries, Hash Maps, Binary Max-Heaps, QuickSort, MergeSort, and Graph Breadth-First Search.</w:t>
+        <w:t xml:space="preserve">We, the undersigned candidates (Swarup Linge and Project Partner), hereby declare that this laboratory project titled "Rhythm Box: Algorithmic Audio Platform &amp; DSA Showcase" has been collaboratively designed, engineered, implemented, and verified by our pair team as part of the CS-302 Data Structures and Algorithms curriculum. We certify that our codebase completely rejects native array method shortcuts (such as Array.prototype.find, filter, sort, or slice) for all primary data operations, implementing all 8 data structures from first principles in vanilla TypeScript.</w:t>
       </w:r>
     </w:p>
     <w:p>
@@ -956,7 +1239,7 @@
           <w:sz w:val="22"/>
           <w:szCs w:val="22"/>
         </w:rPr>
-        <w:t xml:space="preserve">Rhythm Box resolves this fundamental engineering bottleneck by replacing all native data shortcuts with 8 custom, hand-crafted Data Structures and Algorithms (DSA) classes written in pure vanilla TypeScript. Every single transport control, queue modification, search keystroke, leaderboard reranking, and playlist sort maps directly to an optimal algorithmic class with mathematically guaranteed asymptotic time and space bounds.</w:t>
+        <w:t xml:space="preserve">Our team engineered Rhythm Box to resolve this fundamental computational bottleneck. By replacing all native shortcuts with 8 custom, hand-crafted Data Structures and Algorithms (DSA) classes written in pure vanilla TypeScript, every single transport control, queue modification, search keystroke, leaderboard reranking, and playlist sort maps directly to an optimal algorithmic class with mathematically guaranteed asymptotic time and space bounds.</w:t>
       </w:r>
     </w:p>
     <w:p>
@@ -3617,7 +3900,7 @@
           <w:sz w:val="22"/>
           <w:szCs w:val="22"/>
         </w:rPr>
-        <w:t xml:space="preserve">The following matrix details the 14 comprehensive test cases executed against the Rhythm Box platform across all custom DSA modules. All test cases passed with 100% verification:</w:t>
+        <w:t xml:space="preserve">The following matrix details the 14 comprehensive test cases executed against the Rhythm Box platform across all custom DSA modules. All test cases were verified and passed jointly by our engineering team:</w:t>
       </w:r>
     </w:p>
     <w:tbl>
@@ -7200,42 +7483,43 @@
                 <w:sz w:val="19"/>
                 <w:szCs w:val="19"/>
               </w:rPr>
-              <w:t xml:space="preserve">Presenter / Candidate</w:t>
-            </w:r>
-          </w:p>
-        </w:tc>
-        <w:tc>
-          <w:tcPr>
-            <w:gridSpan w:val="1"/>
-            <w:tcBorders>
-              <w:top w:val="single" w:color="CBD5E1" w:sz="1"/>
-              <w:left w:val="single" w:color="CBD5E1" w:sz="1"/>
-              <w:bottom w:val="single" w:color="CBD5E1" w:sz="1"/>
-              <w:right w:val="single" w:color="CBD5E1" w:sz="1"/>
-            </w:tcBorders>
-            <w:shd w:fill="FFFFFF" w:val="clear"/>
-            <w:tcMar>
-              <w:top w:type="dxa" w:w="100"/>
-              <w:left w:type="dxa" w:w="140"/>
-              <w:bottom w:type="dxa" w:w="100"/>
-              <w:right w:type="dxa" w:w="140"/>
-            </w:tcMar>
-          </w:tcPr>
-          <w:p>
-            <w:pPr>
-              <w:spacing w:after="60" w:before="60"/>
-              <w:jc w:val="left"/>
-            </w:pPr>
-            <w:r>
-              <w:rPr>
-                <w:rFonts w:ascii="Arial" w:cs="Arial" w:eastAsia="Arial" w:hAnsi="Arial"/>
-                <w:b/>
-                <w:bCs/>
-                <w:color w:val="334155"/>
-                <w:sz w:val="19"/>
-                <w:szCs w:val="19"/>
-              </w:rPr>
-              <w:t xml:space="preserve">Swarup Linge (Roll: 24 | SAP ID: 70012023001)</w:t>
+              <w:t xml:space="preserve">Joint Presenters (Team of 2)</w:t>
+            </w:r>
+          </w:p>
+        </w:tc>
+        <w:tc>
+          <w:tcPr>
+            <w:gridSpan w:val="1"/>
+            <w:tcBorders>
+              <w:top w:val="single" w:color="CBD5E1" w:sz="1"/>
+              <w:left w:val="single" w:color="CBD5E1" w:sz="1"/>
+              <w:bottom w:val="single" w:color="CBD5E1" w:sz="1"/>
+              <w:right w:val="single" w:color="CBD5E1" w:sz="1"/>
+            </w:tcBorders>
+            <w:shd w:fill="FFFFFF" w:val="clear"/>
+            <w:tcMar>
+              <w:top w:type="dxa" w:w="100"/>
+              <w:left w:type="dxa" w:w="140"/>
+              <w:bottom w:type="dxa" w:w="100"/>
+              <w:right w:type="dxa" w:w="140"/>
+            </w:tcMar>
+          </w:tcPr>
+          <w:p>
+            <w:pPr>
+              <w:spacing w:after="60" w:before="60"/>
+              <w:jc w:val="left"/>
+            </w:pPr>
+            <w:r>
+              <w:rPr>
+                <w:rFonts w:ascii="Arial" w:cs="Arial" w:eastAsia="Arial" w:hAnsi="Arial"/>
+                <w:b/>
+                <w:bCs/>
+                <w:color w:val="334155"/>
+                <w:sz w:val="19"/>
+                <w:szCs w:val="19"/>
+              </w:rPr>
+              <w:t xml:space="preserve">1. Swarup Linge (Roll No: 24 | SAP ID: 70012023001)
+2. [Project Partner / Co-Developer Name] (Roll No: [Partner Roll] | SAP ID: [Partner SAP])</w:t>
             </w:r>
           </w:p>
         </w:tc>
@@ -7379,7 +7663,7 @@
                 <w:sz w:val="19"/>
                 <w:szCs w:val="19"/>
               </w:rPr>
-              <w:t xml:space="preserve">DSA_RhythmBox_Presentation_SwarupLinge.mp4</w:t>
+              <w:t xml:space="preserve">DSA_RhythmBox_JointPresentation_SwarupLinge_Partner.mp4</w:t>
             </w:r>
           </w:p>
         </w:tc>
@@ -7451,7 +7735,7 @@
                 <w:sz w:val="19"/>
                 <w:szCs w:val="19"/>
               </w:rPr>
-              <w:t xml:space="preserve">1080p Full HD (1920x1080), 60 FPS, AAC 320kbps Stereo Audio</w:t>
+              <w:t xml:space="preserve">1080p Full HD (1920x1080), 60 FPS, AAC 320kbps Dual-Channel Stereo</w:t>
             </w:r>
           </w:p>
         </w:tc>
@@ -7523,7 +7807,7 @@
                 <w:sz w:val="19"/>
                 <w:szCs w:val="19"/>
               </w:rPr>
-              <w:t xml:space="preserve">07:00 Minutes (Strictly timed presentation script)</w:t>
+              <w:t xml:space="preserve">07:00 Minutes (Joint structured demonstration script)</w:t>
             </w:r>
           </w:p>
         </w:tc>
@@ -7688,7 +7972,7 @@
           <w:sz w:val="26"/>
           <w:szCs w:val="26"/>
         </w:rPr>
-        <w:t xml:space="preserve">3.2 Video Presentation Script &amp; Timestamp Log</w:t>
+        <w:t xml:space="preserve">3.2 Video Presentation Script &amp; Timestamp Log (Dual-Speaker)</w:t>
       </w:r>
     </w:p>
     <w:p>
@@ -7705,7 +7989,7 @@
           <w:sz w:val="22"/>
           <w:szCs w:val="22"/>
         </w:rPr>
-        <w:t xml:space="preserve">The presentation video strictly follows a structured 7-minute chronological script, demonstrating each custom data structure live inside the running application:</w:t>
+        <w:t xml:space="preserve">The presentation video strictly follows a structured 7-minute chronological script, with duties divided equally between both candidates to demonstrate each custom data structure live inside the running application:</w:t>
       </w:r>
     </w:p>
     <w:tbl>
@@ -7721,15 +8005,16 @@
         </w:tblBorders>
       </w:tblPr>
       <w:tblGrid>
-        <w:gridCol w:w="1440"/>
-        <w:gridCol w:w="2112"/>
-        <w:gridCol w:w="3169"/>
-        <w:gridCol w:w="2881"/>
+        <w:gridCol w:w="1344"/>
+        <w:gridCol w:w="1536"/>
+        <w:gridCol w:w="1728"/>
+        <w:gridCol w:w="2689"/>
+        <w:gridCol w:w="2304"/>
       </w:tblGrid>
       <w:tr>
         <w:tc>
           <w:tcPr>
-            <w:tcW w:type="pct" w:w="750"/>
+            <w:tcW w:type="pct" w:w="700"/>
             <w:gridSpan w:val="1"/>
             <w:tcBorders>
               <w:top w:val="single" w:color="CBD5E1" w:sz="1"/>
@@ -7765,7 +8050,7 @@
         </w:tc>
         <w:tc>
           <w:tcPr>
-            <w:tcW w:type="pct" w:w="1100"/>
+            <w:tcW w:type="pct" w:w="800"/>
             <w:gridSpan w:val="1"/>
             <w:tcBorders>
               <w:top w:val="single" w:color="CBD5E1" w:sz="1"/>
@@ -7795,13 +8080,49 @@
                 <w:sz w:val="19"/>
                 <w:szCs w:val="19"/>
               </w:rPr>
+              <w:t xml:space="preserve">Presenter</w:t>
+            </w:r>
+          </w:p>
+        </w:tc>
+        <w:tc>
+          <w:tcPr>
+            <w:tcW w:type="pct" w:w="900"/>
+            <w:gridSpan w:val="1"/>
+            <w:tcBorders>
+              <w:top w:val="single" w:color="CBD5E1" w:sz="1"/>
+              <w:left w:val="single" w:color="CBD5E1" w:sz="1"/>
+              <w:bottom w:val="single" w:color="CBD5E1" w:sz="1"/>
+              <w:right w:val="single" w:color="CBD5E1" w:sz="1"/>
+            </w:tcBorders>
+            <w:shd w:fill="1E293B" w:val="clear"/>
+            <w:tcMar>
+              <w:top w:type="dxa" w:w="100"/>
+              <w:left w:type="dxa" w:w="140"/>
+              <w:bottom w:type="dxa" w:w="100"/>
+              <w:right w:type="dxa" w:w="140"/>
+            </w:tcMar>
+          </w:tcPr>
+          <w:p>
+            <w:pPr>
+              <w:spacing w:after="60" w:before="60"/>
+              <w:jc w:val="left"/>
+            </w:pPr>
+            <w:r>
+              <w:rPr>
+                <w:rFonts w:ascii="Arial" w:cs="Arial" w:eastAsia="Arial" w:hAnsi="Arial"/>
+                <w:b/>
+                <w:bCs/>
+                <w:color w:val="FFFFFF"/>
+                <w:sz w:val="19"/>
+                <w:szCs w:val="19"/>
+              </w:rPr>
               <w:t xml:space="preserve">Phase / Segment</w:t>
             </w:r>
           </w:p>
         </w:tc>
         <w:tc>
           <w:tcPr>
-            <w:tcW w:type="pct" w:w="1650"/>
+            <w:tcW w:type="pct" w:w="1400"/>
             <w:gridSpan w:val="1"/>
             <w:tcBorders>
               <w:top w:val="single" w:color="CBD5E1" w:sz="1"/>
@@ -7837,7 +8158,7 @@
         </w:tc>
         <w:tc>
           <w:tcPr>
-            <w:tcW w:type="pct" w:w="1500"/>
+            <w:tcW w:type="pct" w:w="1200"/>
             <w:gridSpan w:val="1"/>
             <w:tcBorders>
               <w:top w:val="single" w:color="CBD5E1" w:sz="1"/>
@@ -7935,81 +8256,117 @@
                 <w:rFonts w:ascii="Arial" w:cs="Arial" w:eastAsia="Arial" w:hAnsi="Arial"/>
                 <w:b/>
                 <w:bCs/>
-                <w:color w:val="334155"/>
-                <w:sz w:val="19"/>
-                <w:szCs w:val="19"/>
-              </w:rPr>
-              <w:t xml:space="preserve">Introduction &amp; Overview</w:t>
-            </w:r>
-          </w:p>
-        </w:tc>
-        <w:tc>
-          <w:tcPr>
-            <w:gridSpan w:val="1"/>
-            <w:tcBorders>
-              <w:top w:val="single" w:color="CBD5E1" w:sz="1"/>
-              <w:left w:val="single" w:color="CBD5E1" w:sz="1"/>
-              <w:bottom w:val="single" w:color="CBD5E1" w:sz="1"/>
-              <w:right w:val="single" w:color="CBD5E1" w:sz="1"/>
-            </w:tcBorders>
-            <w:shd w:fill="FFFFFF" w:val="clear"/>
-            <w:tcMar>
-              <w:top w:type="dxa" w:w="100"/>
-              <w:left w:type="dxa" w:w="140"/>
-              <w:bottom w:type="dxa" w:w="100"/>
-              <w:right w:type="dxa" w:w="140"/>
-            </w:tcMar>
-          </w:tcPr>
-          <w:p>
-            <w:pPr>
-              <w:spacing w:after="60" w:before="60"/>
-              <w:jc w:val="left"/>
-            </w:pPr>
-            <w:r>
-              <w:rPr>
-                <w:rFonts w:ascii="Arial" w:cs="Arial" w:eastAsia="Arial" w:hAnsi="Arial"/>
-                <w:b w:val="false"/>
-                <w:bCs w:val="false"/>
-                <w:color w:val="334155"/>
-                <w:sz w:val="19"/>
-                <w:szCs w:val="19"/>
-              </w:rPr>
-              <w:t xml:space="preserve">Candidate on webcam; displays cover slide, project title, and terminal showing Vite dev server running at localhost:5173.</w:t>
-            </w:r>
-          </w:p>
-        </w:tc>
-        <w:tc>
-          <w:tcPr>
-            <w:gridSpan w:val="1"/>
-            <w:tcBorders>
-              <w:top w:val="single" w:color="CBD5E1" w:sz="1"/>
-              <w:left w:val="single" w:color="CBD5E1" w:sz="1"/>
-              <w:bottom w:val="single" w:color="CBD5E1" w:sz="1"/>
-              <w:right w:val="single" w:color="CBD5E1" w:sz="1"/>
-            </w:tcBorders>
-            <w:shd w:fill="FFFFFF" w:val="clear"/>
-            <w:tcMar>
-              <w:top w:type="dxa" w:w="100"/>
-              <w:left w:type="dxa" w:w="140"/>
-              <w:bottom w:type="dxa" w:w="100"/>
-              <w:right w:type="dxa" w:w="140"/>
-            </w:tcMar>
-          </w:tcPr>
-          <w:p>
-            <w:pPr>
-              <w:spacing w:after="60" w:before="60"/>
-              <w:jc w:val="left"/>
-            </w:pPr>
-            <w:r>
-              <w:rPr>
-                <w:rFonts w:ascii="Arial" w:cs="Arial" w:eastAsia="Arial" w:hAnsi="Arial"/>
-                <w:b w:val="false"/>
-                <w:bCs w:val="false"/>
-                <w:color w:val="334155"/>
-                <w:sz w:val="19"/>
-                <w:szCs w:val="19"/>
-              </w:rPr>
-              <w:t xml:space="preserve">States candidate details (Swarup Linge, SAP: 70012023001) and introduces the core philosophy: zero native array shortcuts.</w:t>
+                <w:color w:val="0F172A"/>
+                <w:sz w:val="19"/>
+                <w:szCs w:val="19"/>
+              </w:rPr>
+              <w:t xml:space="preserve">Swarup Linge &amp;
+Partner</w:t>
+            </w:r>
+          </w:p>
+        </w:tc>
+        <w:tc>
+          <w:tcPr>
+            <w:gridSpan w:val="1"/>
+            <w:tcBorders>
+              <w:top w:val="single" w:color="CBD5E1" w:sz="1"/>
+              <w:left w:val="single" w:color="CBD5E1" w:sz="1"/>
+              <w:bottom w:val="single" w:color="CBD5E1" w:sz="1"/>
+              <w:right w:val="single" w:color="CBD5E1" w:sz="1"/>
+            </w:tcBorders>
+            <w:shd w:fill="FFFFFF" w:val="clear"/>
+            <w:tcMar>
+              <w:top w:type="dxa" w:w="100"/>
+              <w:left w:type="dxa" w:w="140"/>
+              <w:bottom w:type="dxa" w:w="100"/>
+              <w:right w:type="dxa" w:w="140"/>
+            </w:tcMar>
+          </w:tcPr>
+          <w:p>
+            <w:pPr>
+              <w:spacing w:after="60" w:before="60"/>
+              <w:jc w:val="left"/>
+            </w:pPr>
+            <w:r>
+              <w:rPr>
+                <w:rFonts w:ascii="Arial" w:cs="Arial" w:eastAsia="Arial" w:hAnsi="Arial"/>
+                <w:b/>
+                <w:bCs/>
+                <w:color w:val="334155"/>
+                <w:sz w:val="19"/>
+                <w:szCs w:val="19"/>
+              </w:rPr>
+              <w:t xml:space="preserve">Joint Team Intro &amp; Vision</w:t>
+            </w:r>
+          </w:p>
+        </w:tc>
+        <w:tc>
+          <w:tcPr>
+            <w:gridSpan w:val="1"/>
+            <w:tcBorders>
+              <w:top w:val="single" w:color="CBD5E1" w:sz="1"/>
+              <w:left w:val="single" w:color="CBD5E1" w:sz="1"/>
+              <w:bottom w:val="single" w:color="CBD5E1" w:sz="1"/>
+              <w:right w:val="single" w:color="CBD5E1" w:sz="1"/>
+            </w:tcBorders>
+            <w:shd w:fill="FFFFFF" w:val="clear"/>
+            <w:tcMar>
+              <w:top w:type="dxa" w:w="100"/>
+              <w:left w:type="dxa" w:w="140"/>
+              <w:bottom w:type="dxa" w:w="100"/>
+              <w:right w:type="dxa" w:w="140"/>
+            </w:tcMar>
+          </w:tcPr>
+          <w:p>
+            <w:pPr>
+              <w:spacing w:after="60" w:before="60"/>
+              <w:jc w:val="left"/>
+            </w:pPr>
+            <w:r>
+              <w:rPr>
+                <w:rFonts w:ascii="Arial" w:cs="Arial" w:eastAsia="Arial" w:hAnsi="Arial"/>
+                <w:b w:val="false"/>
+                <w:bCs w:val="false"/>
+                <w:color w:val="334155"/>
+                <w:sz w:val="19"/>
+                <w:szCs w:val="19"/>
+              </w:rPr>
+              <w:t xml:space="preserve">Both team members on dual webcams; display cover slide, project title, and terminal showing Vite dev server running at localhost:5173.</w:t>
+            </w:r>
+          </w:p>
+        </w:tc>
+        <w:tc>
+          <w:tcPr>
+            <w:gridSpan w:val="1"/>
+            <w:tcBorders>
+              <w:top w:val="single" w:color="CBD5E1" w:sz="1"/>
+              <w:left w:val="single" w:color="CBD5E1" w:sz="1"/>
+              <w:bottom w:val="single" w:color="CBD5E1" w:sz="1"/>
+              <w:right w:val="single" w:color="CBD5E1" w:sz="1"/>
+            </w:tcBorders>
+            <w:shd w:fill="FFFFFF" w:val="clear"/>
+            <w:tcMar>
+              <w:top w:type="dxa" w:w="100"/>
+              <w:left w:type="dxa" w:w="140"/>
+              <w:bottom w:type="dxa" w:w="100"/>
+              <w:right w:type="dxa" w:w="140"/>
+            </w:tcMar>
+          </w:tcPr>
+          <w:p>
+            <w:pPr>
+              <w:spacing w:after="60" w:before="60"/>
+              <w:jc w:val="left"/>
+            </w:pPr>
+            <w:r>
+              <w:rPr>
+                <w:rFonts w:ascii="Arial" w:cs="Arial" w:eastAsia="Arial" w:hAnsi="Arial"/>
+                <w:b w:val="false"/>
+                <w:bCs w:val="false"/>
+                <w:color w:val="334155"/>
+                <w:sz w:val="19"/>
+                <w:szCs w:val="19"/>
+              </w:rPr>
+              <w:t xml:space="preserve">Introduce candidate credentials, division of engineering roles, and our team philosophy: zero native array shortcuts.</w:t>
             </w:r>
           </w:p>
         </w:tc>
@@ -8077,6 +8434,41 @@
                 <w:rFonts w:ascii="Arial" w:cs="Arial" w:eastAsia="Arial" w:hAnsi="Arial"/>
                 <w:b/>
                 <w:bCs/>
+                <w:color w:val="0F5132"/>
+                <w:sz w:val="19"/>
+                <w:szCs w:val="19"/>
+              </w:rPr>
+              <w:t xml:space="preserve">Swarup Linge</w:t>
+            </w:r>
+          </w:p>
+        </w:tc>
+        <w:tc>
+          <w:tcPr>
+            <w:gridSpan w:val="1"/>
+            <w:tcBorders>
+              <w:top w:val="single" w:color="CBD5E1" w:sz="1"/>
+              <w:left w:val="single" w:color="CBD5E1" w:sz="1"/>
+              <w:bottom w:val="single" w:color="CBD5E1" w:sz="1"/>
+              <w:right w:val="single" w:color="CBD5E1" w:sz="1"/>
+            </w:tcBorders>
+            <w:shd w:fill="FFFFFF" w:val="clear"/>
+            <w:tcMar>
+              <w:top w:type="dxa" w:w="100"/>
+              <w:left w:type="dxa" w:w="140"/>
+              <w:bottom w:type="dxa" w:w="100"/>
+              <w:right w:type="dxa" w:w="140"/>
+            </w:tcMar>
+          </w:tcPr>
+          <w:p>
+            <w:pPr>
+              <w:spacing w:after="60" w:before="60"/>
+              <w:jc w:val="left"/>
+            </w:pPr>
+            <w:r>
+              <w:rPr>
+                <w:rFonts w:ascii="Arial" w:cs="Arial" w:eastAsia="Arial" w:hAnsi="Arial"/>
+                <w:b/>
+                <w:bCs/>
                 <w:color w:val="334155"/>
                 <w:sz w:val="19"/>
                 <w:szCs w:val="19"/>
@@ -8116,42 +8508,42 @@
                 <w:sz w:val="19"/>
                 <w:szCs w:val="19"/>
               </w:rPr>
-              <w:t xml:space="preserve">Shows Spotify dark-themed UI; opens Chrome DevTools performance monitor.</w:t>
-            </w:r>
-          </w:p>
-        </w:tc>
-        <w:tc>
-          <w:tcPr>
-            <w:gridSpan w:val="1"/>
-            <w:tcBorders>
-              <w:top w:val="single" w:color="CBD5E1" w:sz="1"/>
-              <w:left w:val="single" w:color="CBD5E1" w:sz="1"/>
-              <w:bottom w:val="single" w:color="CBD5E1" w:sz="1"/>
-              <w:right w:val="single" w:color="CBD5E1" w:sz="1"/>
-            </w:tcBorders>
-            <w:shd w:fill="FFFFFF" w:val="clear"/>
-            <w:tcMar>
-              <w:top w:type="dxa" w:w="100"/>
-              <w:left w:type="dxa" w:w="140"/>
-              <w:bottom w:type="dxa" w:w="100"/>
-              <w:right w:type="dxa" w:w="140"/>
-            </w:tcMar>
-          </w:tcPr>
-          <w:p>
-            <w:pPr>
-              <w:spacing w:after="60" w:before="60"/>
-              <w:jc w:val="left"/>
-            </w:pPr>
-            <w:r>
-              <w:rPr>
-                <w:rFonts w:ascii="Arial" w:cs="Arial" w:eastAsia="Arial" w:hAnsi="Arial"/>
-                <w:b w:val="false"/>
-                <w:bCs w:val="false"/>
-                <w:color w:val="334155"/>
-                <w:sz w:val="19"/>
-                <w:szCs w:val="19"/>
-              </w:rPr>
-              <w:t xml:space="preserve">Explains why commercial audio players need O(1) transitions instead of O(N) array shifts; maps music operations to 8 DSA concepts.</w:t>
+              <w:t xml:space="preserve">Displays dark-themed UI; opens Chrome DevTools performance monitor showing frame timing.</w:t>
+            </w:r>
+          </w:p>
+        </w:tc>
+        <w:tc>
+          <w:tcPr>
+            <w:gridSpan w:val="1"/>
+            <w:tcBorders>
+              <w:top w:val="single" w:color="CBD5E1" w:sz="1"/>
+              <w:left w:val="single" w:color="CBD5E1" w:sz="1"/>
+              <w:bottom w:val="single" w:color="CBD5E1" w:sz="1"/>
+              <w:right w:val="single" w:color="CBD5E1" w:sz="1"/>
+            </w:tcBorders>
+            <w:shd w:fill="FFFFFF" w:val="clear"/>
+            <w:tcMar>
+              <w:top w:type="dxa" w:w="100"/>
+              <w:left w:type="dxa" w:w="140"/>
+              <w:bottom w:type="dxa" w:w="100"/>
+              <w:right w:type="dxa" w:w="140"/>
+            </w:tcMar>
+          </w:tcPr>
+          <w:p>
+            <w:pPr>
+              <w:spacing w:after="60" w:before="60"/>
+              <w:jc w:val="left"/>
+            </w:pPr>
+            <w:r>
+              <w:rPr>
+                <w:rFonts w:ascii="Arial" w:cs="Arial" w:eastAsia="Arial" w:hAnsi="Arial"/>
+                <w:b w:val="false"/>
+                <w:bCs w:val="false"/>
+                <w:color w:val="334155"/>
+                <w:sz w:val="19"/>
+                <w:szCs w:val="19"/>
+              </w:rPr>
+              <w:t xml:space="preserve">Explains why audio players require O(1) transitions instead of O(N) array shifts; maps music operations to 8 DSA concepts.</w:t>
             </w:r>
           </w:p>
         </w:tc>
@@ -8219,6 +8611,41 @@
                 <w:rFonts w:ascii="Arial" w:cs="Arial" w:eastAsia="Arial" w:hAnsi="Arial"/>
                 <w:b/>
                 <w:bCs/>
+                <w:color w:val="0F5132"/>
+                <w:sz w:val="19"/>
+                <w:szCs w:val="19"/>
+              </w:rPr>
+              <w:t xml:space="preserve">Swarup Linge</w:t>
+            </w:r>
+          </w:p>
+        </w:tc>
+        <w:tc>
+          <w:tcPr>
+            <w:gridSpan w:val="1"/>
+            <w:tcBorders>
+              <w:top w:val="single" w:color="CBD5E1" w:sz="1"/>
+              <w:left w:val="single" w:color="CBD5E1" w:sz="1"/>
+              <w:bottom w:val="single" w:color="CBD5E1" w:sz="1"/>
+              <w:right w:val="single" w:color="CBD5E1" w:sz="1"/>
+            </w:tcBorders>
+            <w:shd w:fill="FFFFFF" w:val="clear"/>
+            <w:tcMar>
+              <w:top w:type="dxa" w:w="100"/>
+              <w:left w:type="dxa" w:w="140"/>
+              <w:bottom w:type="dxa" w:w="100"/>
+              <w:right w:type="dxa" w:w="140"/>
+            </w:tcMar>
+          </w:tcPr>
+          <w:p>
+            <w:pPr>
+              <w:spacing w:after="60" w:before="60"/>
+              <w:jc w:val="left"/>
+            </w:pPr>
+            <w:r>
+              <w:rPr>
+                <w:rFonts w:ascii="Arial" w:cs="Arial" w:eastAsia="Arial" w:hAnsi="Arial"/>
+                <w:b/>
+                <w:bCs/>
                 <w:color w:val="334155"/>
                 <w:sz w:val="19"/>
                 <w:szCs w:val="19"/>
@@ -8258,42 +8685,42 @@
                 <w:sz w:val="19"/>
                 <w:szCs w:val="19"/>
               </w:rPr>
-              <w:t xml:space="preserve">Clicks Next/Previous buttons on Player Deck; observes rotating vinyl and DLL pointer HUD; enqueues 2 songs into Up Next queue.</w:t>
-            </w:r>
-          </w:p>
-        </w:tc>
-        <w:tc>
-          <w:tcPr>
-            <w:gridSpan w:val="1"/>
-            <w:tcBorders>
-              <w:top w:val="single" w:color="CBD5E1" w:sz="1"/>
-              <w:left w:val="single" w:color="CBD5E1" w:sz="1"/>
-              <w:bottom w:val="single" w:color="CBD5E1" w:sz="1"/>
-              <w:right w:val="single" w:color="CBD5E1" w:sz="1"/>
-            </w:tcBorders>
-            <w:shd w:fill="FFFFFF" w:val="clear"/>
-            <w:tcMar>
-              <w:top w:type="dxa" w:w="100"/>
-              <w:left w:type="dxa" w:w="140"/>
-              <w:bottom w:type="dxa" w:w="100"/>
-              <w:right w:type="dxa" w:w="140"/>
-            </w:tcMar>
-          </w:tcPr>
-          <w:p>
-            <w:pPr>
-              <w:spacing w:after="60" w:before="60"/>
-              <w:jc w:val="left"/>
-            </w:pPr>
-            <w:r>
-              <w:rPr>
-                <w:rFonts w:ascii="Arial" w:cs="Arial" w:eastAsia="Arial" w:hAnsi="Arial"/>
-                <w:b w:val="false"/>
-                <w:bCs w:val="false"/>
-                <w:color w:val="334155"/>
-                <w:sz w:val="19"/>
-                <w:szCs w:val="19"/>
-              </w:rPr>
-              <w:t xml:space="preserve">Explains SongNode prev/next pointers delivering O(1) bidirectional traversal; demonstrates FIFO Queue.dequeue() priority on song finish.</w:t>
+              <w:t xml:space="preserve">Clicks Next/Previous on Player Deck; observes rotating vinyl and DLL pointer HUD; enqueues 2 songs into Up Next queue.</w:t>
+            </w:r>
+          </w:p>
+        </w:tc>
+        <w:tc>
+          <w:tcPr>
+            <w:gridSpan w:val="1"/>
+            <w:tcBorders>
+              <w:top w:val="single" w:color="CBD5E1" w:sz="1"/>
+              <w:left w:val="single" w:color="CBD5E1" w:sz="1"/>
+              <w:bottom w:val="single" w:color="CBD5E1" w:sz="1"/>
+              <w:right w:val="single" w:color="CBD5E1" w:sz="1"/>
+            </w:tcBorders>
+            <w:shd w:fill="FFFFFF" w:val="clear"/>
+            <w:tcMar>
+              <w:top w:type="dxa" w:w="100"/>
+              <w:left w:type="dxa" w:w="140"/>
+              <w:bottom w:type="dxa" w:w="100"/>
+              <w:right w:type="dxa" w:w="140"/>
+            </w:tcMar>
+          </w:tcPr>
+          <w:p>
+            <w:pPr>
+              <w:spacing w:after="60" w:before="60"/>
+              <w:jc w:val="left"/>
+            </w:pPr>
+            <w:r>
+              <w:rPr>
+                <w:rFonts w:ascii="Arial" w:cs="Arial" w:eastAsia="Arial" w:hAnsi="Arial"/>
+                <w:b w:val="false"/>
+                <w:bCs w:val="false"/>
+                <w:color w:val="334155"/>
+                <w:sz w:val="19"/>
+                <w:szCs w:val="19"/>
+              </w:rPr>
+              <w:t xml:space="preserve">Explains SongNode prev/next pointers delivering O(1) traversal; demonstrates FIFO Queue.dequeue() priority on song finish.</w:t>
             </w:r>
           </w:p>
         </w:tc>
@@ -8361,6 +8788,42 @@
                 <w:rFonts w:ascii="Arial" w:cs="Arial" w:eastAsia="Arial" w:hAnsi="Arial"/>
                 <w:b/>
                 <w:bCs/>
+                <w:color w:val="0F172A"/>
+                <w:sz w:val="19"/>
+                <w:szCs w:val="19"/>
+              </w:rPr>
+              <w:t xml:space="preserve">Swarup &amp; Partner
+(Joint handoff)</w:t>
+            </w:r>
+          </w:p>
+        </w:tc>
+        <w:tc>
+          <w:tcPr>
+            <w:gridSpan w:val="1"/>
+            <w:tcBorders>
+              <w:top w:val="single" w:color="CBD5E1" w:sz="1"/>
+              <w:left w:val="single" w:color="CBD5E1" w:sz="1"/>
+              <w:bottom w:val="single" w:color="CBD5E1" w:sz="1"/>
+              <w:right w:val="single" w:color="CBD5E1" w:sz="1"/>
+            </w:tcBorders>
+            <w:shd w:fill="FFFFFF" w:val="clear"/>
+            <w:tcMar>
+              <w:top w:type="dxa" w:w="100"/>
+              <w:left w:type="dxa" w:w="140"/>
+              <w:bottom w:type="dxa" w:w="100"/>
+              <w:right w:type="dxa" w:w="140"/>
+            </w:tcMar>
+          </w:tcPr>
+          <w:p>
+            <w:pPr>
+              <w:spacing w:after="60" w:before="60"/>
+              <w:jc w:val="left"/>
+            </w:pPr>
+            <w:r>
+              <w:rPr>
+                <w:rFonts w:ascii="Arial" w:cs="Arial" w:eastAsia="Arial" w:hAnsi="Arial"/>
+                <w:b/>
+                <w:bCs/>
                 <w:color w:val="334155"/>
                 <w:sz w:val="19"/>
                 <w:szCs w:val="19"/>
@@ -8400,42 +8863,42 @@
                 <w:sz w:val="19"/>
                 <w:szCs w:val="19"/>
               </w:rPr>
-              <w:t xml:space="preserve">Types "algo", "synth", "hard" into Trie search terminal; toggles heart icon on multiple tracks in library table.</w:t>
-            </w:r>
-          </w:p>
-        </w:tc>
-        <w:tc>
-          <w:tcPr>
-            <w:gridSpan w:val="1"/>
-            <w:tcBorders>
-              <w:top w:val="single" w:color="CBD5E1" w:sz="1"/>
-              <w:left w:val="single" w:color="CBD5E1" w:sz="1"/>
-              <w:bottom w:val="single" w:color="CBD5E1" w:sz="1"/>
-              <w:right w:val="single" w:color="CBD5E1" w:sz="1"/>
-            </w:tcBorders>
-            <w:shd w:fill="FFFFFF" w:val="clear"/>
-            <w:tcMar>
-              <w:top w:type="dxa" w:w="100"/>
-              <w:left w:type="dxa" w:w="140"/>
-              <w:bottom w:type="dxa" w:w="100"/>
-              <w:right w:type="dxa" w:w="140"/>
-            </w:tcMar>
-          </w:tcPr>
-          <w:p>
-            <w:pPr>
-              <w:spacing w:after="60" w:before="60"/>
-              <w:jc w:val="left"/>
-            </w:pPr>
-            <w:r>
-              <w:rPr>
-                <w:rFonts w:ascii="Arial" w:cs="Arial" w:eastAsia="Arial" w:hAnsi="Arial"/>
-                <w:b w:val="false"/>
-                <w:bCs w:val="false"/>
-                <w:color w:val="334155"/>
-                <w:sz w:val="19"/>
-                <w:szCs w:val="19"/>
-              </w:rPr>
-              <w:t xml:space="preserve">Breaks down Trie prefix traversal in O(L) time vs linear O(N) scans; explains djb2 separate chaining hash map delivering O(1) favorites lookup.</w:t>
+              <w:t xml:space="preserve">Swarup types "algo", "chill" into Trie search; Partner takes over screen and toggles heart icon on multiple tracks in library table.</w:t>
+            </w:r>
+          </w:p>
+        </w:tc>
+        <w:tc>
+          <w:tcPr>
+            <w:gridSpan w:val="1"/>
+            <w:tcBorders>
+              <w:top w:val="single" w:color="CBD5E1" w:sz="1"/>
+              <w:left w:val="single" w:color="CBD5E1" w:sz="1"/>
+              <w:bottom w:val="single" w:color="CBD5E1" w:sz="1"/>
+              <w:right w:val="single" w:color="CBD5E1" w:sz="1"/>
+            </w:tcBorders>
+            <w:shd w:fill="FFFFFF" w:val="clear"/>
+            <w:tcMar>
+              <w:top w:type="dxa" w:w="100"/>
+              <w:left w:type="dxa" w:w="140"/>
+              <w:bottom w:type="dxa" w:w="100"/>
+              <w:right w:type="dxa" w:w="140"/>
+            </w:tcMar>
+          </w:tcPr>
+          <w:p>
+            <w:pPr>
+              <w:spacing w:after="60" w:before="60"/>
+              <w:jc w:val="left"/>
+            </w:pPr>
+            <w:r>
+              <w:rPr>
+                <w:rFonts w:ascii="Arial" w:cs="Arial" w:eastAsia="Arial" w:hAnsi="Arial"/>
+                <w:b w:val="false"/>
+                <w:bCs w:val="false"/>
+                <w:color w:val="334155"/>
+                <w:sz w:val="19"/>
+                <w:szCs w:val="19"/>
+              </w:rPr>
+              <w:t xml:space="preserve">Swarup explains Trie prefix traversal in O(L) time; Partner details djb2 separate chaining hash map delivering O(1) favorites lookup.</w:t>
             </w:r>
           </w:p>
         </w:tc>
@@ -8503,6 +8966,41 @@
                 <w:rFonts w:ascii="Arial" w:cs="Arial" w:eastAsia="Arial" w:hAnsi="Arial"/>
                 <w:b/>
                 <w:bCs/>
+                <w:color w:val="15803D"/>
+                <w:sz w:val="19"/>
+                <w:szCs w:val="19"/>
+              </w:rPr>
+              <w:t xml:space="preserve">Project Partner</w:t>
+            </w:r>
+          </w:p>
+        </w:tc>
+        <w:tc>
+          <w:tcPr>
+            <w:gridSpan w:val="1"/>
+            <w:tcBorders>
+              <w:top w:val="single" w:color="CBD5E1" w:sz="1"/>
+              <w:left w:val="single" w:color="CBD5E1" w:sz="1"/>
+              <w:bottom w:val="single" w:color="CBD5E1" w:sz="1"/>
+              <w:right w:val="single" w:color="CBD5E1" w:sz="1"/>
+            </w:tcBorders>
+            <w:shd w:fill="FFFFFF" w:val="clear"/>
+            <w:tcMar>
+              <w:top w:type="dxa" w:w="100"/>
+              <w:left w:type="dxa" w:w="140"/>
+              <w:bottom w:type="dxa" w:w="100"/>
+              <w:right w:type="dxa" w:w="140"/>
+            </w:tcMar>
+          </w:tcPr>
+          <w:p>
+            <w:pPr>
+              <w:spacing w:after="60" w:before="60"/>
+              <w:jc w:val="left"/>
+            </w:pPr>
+            <w:r>
+              <w:rPr>
+                <w:rFonts w:ascii="Arial" w:cs="Arial" w:eastAsia="Arial" w:hAnsi="Arial"/>
+                <w:b/>
+                <w:bCs/>
                 <w:color w:val="334155"/>
                 <w:sz w:val="19"/>
                 <w:szCs w:val="19"/>
@@ -8577,7 +9075,7 @@
                 <w:sz w:val="19"/>
                 <w:szCs w:val="19"/>
               </w:rPr>
-              <w:t xml:space="preserve">Illustrates Binary Max-Heap siftUp() property maintaining O(log N) chart priority; explains Lomuto partitioning vs stable merge sorting.</w:t>
+              <w:t xml:space="preserve">Illustrates Binary Max-Heap siftUp() property maintaining O(log N) chart priority; explains Lomuto title partition vs MergeSort.</w:t>
             </w:r>
           </w:p>
         </w:tc>
@@ -8645,6 +9143,41 @@
                 <w:rFonts w:ascii="Arial" w:cs="Arial" w:eastAsia="Arial" w:hAnsi="Arial"/>
                 <w:b/>
                 <w:bCs/>
+                <w:color w:val="15803D"/>
+                <w:sz w:val="19"/>
+                <w:szCs w:val="19"/>
+              </w:rPr>
+              <w:t xml:space="preserve">Project Partner</w:t>
+            </w:r>
+          </w:p>
+        </w:tc>
+        <w:tc>
+          <w:tcPr>
+            <w:gridSpan w:val="1"/>
+            <w:tcBorders>
+              <w:top w:val="single" w:color="CBD5E1" w:sz="1"/>
+              <w:left w:val="single" w:color="CBD5E1" w:sz="1"/>
+              <w:bottom w:val="single" w:color="CBD5E1" w:sz="1"/>
+              <w:right w:val="single" w:color="CBD5E1" w:sz="1"/>
+            </w:tcBorders>
+            <w:shd w:fill="FFFFFF" w:val="clear"/>
+            <w:tcMar>
+              <w:top w:type="dxa" w:w="100"/>
+              <w:left w:type="dxa" w:w="140"/>
+              <w:bottom w:type="dxa" w:w="100"/>
+              <w:right w:type="dxa" w:w="140"/>
+            </w:tcMar>
+          </w:tcPr>
+          <w:p>
+            <w:pPr>
+              <w:spacing w:after="60" w:before="60"/>
+              <w:jc w:val="left"/>
+            </w:pPr>
+            <w:r>
+              <w:rPr>
+                <w:rFonts w:ascii="Arial" w:cs="Arial" w:eastAsia="Arial" w:hAnsi="Arial"/>
+                <w:b/>
+                <w:bCs/>
                 <w:color w:val="334155"/>
                 <w:sz w:val="19"/>
                 <w:szCs w:val="19"/>
@@ -8787,6 +9320,41 @@
                 <w:rFonts w:ascii="Arial" w:cs="Arial" w:eastAsia="Arial" w:hAnsi="Arial"/>
                 <w:b/>
                 <w:bCs/>
+                <w:color w:val="0F5132"/>
+                <w:sz w:val="19"/>
+                <w:szCs w:val="19"/>
+              </w:rPr>
+              <w:t xml:space="preserve">Swarup Linge</w:t>
+            </w:r>
+          </w:p>
+        </w:tc>
+        <w:tc>
+          <w:tcPr>
+            <w:gridSpan w:val="1"/>
+            <w:tcBorders>
+              <w:top w:val="single" w:color="CBD5E1" w:sz="1"/>
+              <w:left w:val="single" w:color="CBD5E1" w:sz="1"/>
+              <w:bottom w:val="single" w:color="CBD5E1" w:sz="1"/>
+              <w:right w:val="single" w:color="CBD5E1" w:sz="1"/>
+            </w:tcBorders>
+            <w:shd w:fill="FFFFFF" w:val="clear"/>
+            <w:tcMar>
+              <w:top w:type="dxa" w:w="100"/>
+              <w:left w:type="dxa" w:w="140"/>
+              <w:bottom w:type="dxa" w:w="100"/>
+              <w:right w:type="dxa" w:w="140"/>
+            </w:tcMar>
+          </w:tcPr>
+          <w:p>
+            <w:pPr>
+              <w:spacing w:after="60" w:before="60"/>
+              <w:jc w:val="left"/>
+            </w:pPr>
+            <w:r>
+              <w:rPr>
+                <w:rFonts w:ascii="Arial" w:cs="Arial" w:eastAsia="Arial" w:hAnsi="Arial"/>
+                <w:b/>
+                <w:bCs/>
                 <w:color w:val="334155"/>
                 <w:sz w:val="19"/>
                 <w:szCs w:val="19"/>
@@ -8929,11 +9497,47 @@
                 <w:rFonts w:ascii="Arial" w:cs="Arial" w:eastAsia="Arial" w:hAnsi="Arial"/>
                 <w:b/>
                 <w:bCs/>
-                <w:color w:val="334155"/>
-                <w:sz w:val="19"/>
-                <w:szCs w:val="19"/>
-              </w:rPr>
-              <w:t xml:space="preserve">Undo Engine, Tests &amp; Conclusion</w:t>
+                <w:color w:val="0F172A"/>
+                <w:sz w:val="19"/>
+                <w:szCs w:val="19"/>
+              </w:rPr>
+              <w:t xml:space="preserve">Swarup Linge &amp;
+Partner</w:t>
+            </w:r>
+          </w:p>
+        </w:tc>
+        <w:tc>
+          <w:tcPr>
+            <w:gridSpan w:val="1"/>
+            <w:tcBorders>
+              <w:top w:val="single" w:color="CBD5E1" w:sz="1"/>
+              <w:left w:val="single" w:color="CBD5E1" w:sz="1"/>
+              <w:bottom w:val="single" w:color="CBD5E1" w:sz="1"/>
+              <w:right w:val="single" w:color="CBD5E1" w:sz="1"/>
+            </w:tcBorders>
+            <w:shd w:fill="FFFFFF" w:val="clear"/>
+            <w:tcMar>
+              <w:top w:type="dxa" w:w="100"/>
+              <w:left w:type="dxa" w:w="140"/>
+              <w:bottom w:type="dxa" w:w="100"/>
+              <w:right w:type="dxa" w:w="140"/>
+            </w:tcMar>
+          </w:tcPr>
+          <w:p>
+            <w:pPr>
+              <w:spacing w:after="60" w:before="60"/>
+              <w:jc w:val="left"/>
+            </w:pPr>
+            <w:r>
+              <w:rPr>
+                <w:rFonts w:ascii="Arial" w:cs="Arial" w:eastAsia="Arial" w:hAnsi="Arial"/>
+                <w:b/>
+                <w:bCs/>
+                <w:color w:val="334155"/>
+                <w:sz w:val="19"/>
+                <w:szCs w:val="19"/>
+              </w:rPr>
+              <w:t xml:space="preserve">Undo Stack, Tests &amp; Sign-off</w:t>
             </w:r>
           </w:p>
         </w:tc>
@@ -9003,7 +9607,7 @@
                 <w:sz w:val="19"/>
                 <w:szCs w:val="19"/>
               </w:rPr>
-              <w:t xml:space="preserve">Explains LIFO Undo Stack command pattern; summarizes test matrix (all 14 passed); delivers concluding remarks and formal sign-off.</w:t>
+              <w:t xml:space="preserve">Partner summarizes LIFO Undo Stack command pattern; Swarup presents test matrix (all 14 passed); delivers joint closing remarks.</w:t>
             </w:r>
           </w:p>
         </w:tc>
@@ -9040,7 +9644,7 @@
           <w:sz w:val="22"/>
           <w:szCs w:val="22"/>
         </w:rPr>
-        <w:t xml:space="preserve">The demonstration video comprehensively verifies that Rhythm Box successfully fulfills all academic, algorithmic, and software engineering criteria for the CS-302 laboratory project. All 8 custom data structures operate harmoniously without regression, producing a responsive, educational, and mathematically rigorous music player.</w:t>
+        <w:t xml:space="preserve">The demonstration video comprehensively verifies that our collaborative project Rhythm Box successfully fulfills all academic, algorithmic, and software engineering criteria for the CS-302 laboratory project. All 8 custom data structures operate harmoniously without regression, producing a responsive, educational, and mathematically rigorous music player.</w:t>
       </w:r>
     </w:p>
     <w:p>
@@ -9061,13 +9665,14 @@
         </w:tblBorders>
       </w:tblPr>
       <w:tblGrid>
-        <w:gridCol w:w="4801"/>
-        <w:gridCol w:w="4801"/>
+        <w:gridCol w:w="3169"/>
+        <w:gridCol w:w="3169"/>
+        <w:gridCol w:w="3265"/>
       </w:tblGrid>
       <w:tr>
         <w:tc>
           <w:tcPr>
-            <w:tcW w:type="pct" w:w="2500"/>
+            <w:tcW w:type="pct" w:w="1650"/>
             <w:gridSpan w:val="1"/>
             <w:tcBorders>
               <w:top w:val="single" w:color="CBD5E1" w:sz="1"/>
@@ -9091,7 +9696,7 @@
                 <w:sz w:val="20"/>
                 <w:szCs w:val="20"/>
               </w:rPr>
-              <w:t xml:space="preserve">Candidate Signature:</w:t>
+              <w:t xml:space="preserve">Candidate 1 Signature:</w:t>
             </w:r>
             <w:r>
               <w:rPr>
@@ -9115,13 +9720,13 @@
 </w:t>
             </w:r>
             <w:r>
-              <w:t xml:space="preserve">Department of Computer Science &amp; Engineering</w:t>
-            </w:r>
-          </w:p>
-        </w:tc>
-        <w:tc>
-          <w:tcPr>
-            <w:tcW w:type="pct" w:w="2500"/>
+              <w:t xml:space="preserve">Dept of Computer Science &amp; Engineering</w:t>
+            </w:r>
+          </w:p>
+        </w:tc>
+        <w:tc>
+          <w:tcPr>
+            <w:tcW w:type="pct" w:w="1650"/>
             <w:gridSpan w:val="1"/>
             <w:tcBorders>
               <w:top w:val="single" w:color="CBD5E1" w:sz="1"/>
@@ -9145,7 +9750,7 @@
                 <w:sz w:val="20"/>
                 <w:szCs w:val="20"/>
               </w:rPr>
-              <w:t xml:space="preserve">Faculty / Examiner Signature:</w:t>
+              <w:t xml:space="preserve">Candidate 2 Signature:</w:t>
             </w:r>
             <w:r>
               <w:rPr>
@@ -9161,6 +9766,60 @@
                 <w:b/>
                 <w:bCs/>
               </w:rPr>
+              <w:t xml:space="preserve">[Project Partner / Co-Developer]
+</w:t>
+            </w:r>
+            <w:r>
+              <w:t xml:space="preserve">Roll No: [Partner Roll] | SAP ID: [Partner SAP]
+</w:t>
+            </w:r>
+            <w:r>
+              <w:t xml:space="preserve">Dept of Computer Science &amp; Engineering</w:t>
+            </w:r>
+          </w:p>
+        </w:tc>
+        <w:tc>
+          <w:tcPr>
+            <w:tcW w:type="pct" w:w="1700"/>
+            <w:gridSpan w:val="1"/>
+            <w:tcBorders>
+              <w:top w:val="single" w:color="CBD5E1" w:sz="1"/>
+              <w:left w:val="single" w:color="CBD5E1" w:sz="1"/>
+              <w:bottom w:val="single" w:color="CBD5E1" w:sz="1"/>
+              <w:right w:val="single" w:color="CBD5E1" w:sz="1"/>
+            </w:tcBorders>
+            <w:shd w:fill="F8FAFC" w:val="clear"/>
+            <w:tcMar>
+              <w:top w:type="dxa" w:w="100"/>
+              <w:left w:type="dxa" w:w="140"/>
+              <w:bottom w:type="dxa" w:w="100"/>
+              <w:right w:type="dxa" w:w="140"/>
+            </w:tcMar>
+          </w:tcPr>
+          <w:p>
+            <w:r>
+              <w:rPr>
+                <w:b/>
+                <w:bCs/>
+                <w:sz w:val="20"/>
+                <w:szCs w:val="20"/>
+              </w:rPr>
+              <w:t xml:space="preserve">Faculty / Examiner Signature:</w:t>
+            </w:r>
+            <w:r>
+              <w:rPr>
+                <w:b/>
+                <w:bCs/>
+              </w:rPr>
+              <w:t xml:space="preserve">
+___________________________________
+</w:t>
+            </w:r>
+            <w:r>
+              <w:rPr>
+                <w:b/>
+                <w:bCs/>
+              </w:rPr>
               <w:t xml:space="preserve">Evaluator / Committee Member
 </w:t>
             </w:r>
@@ -9169,7 +9828,7 @@
 </w:t>
             </w:r>
             <w:r>
-              <w:t xml:space="preserve">Date of Evaluation: _______________</w:t>
+              <w:t xml:space="preserve">Date: ________________________</w:t>
             </w:r>
           </w:p>
         </w:tc>
@@ -9234,7 +9893,7 @@
         <w:sz w:val="16"/>
         <w:szCs w:val="16"/>
       </w:rPr>
-      <w:t xml:space="preserve">CS-302 / Data Structures &amp; Algorithms Lab Report</w:t>
+      <w:t xml:space="preserve">CS-302 / Data Structures &amp; Algorithms Lab Report (Team of 2)</w:t>
     </w:r>
     <w:r>
       <w:rPr>
@@ -9333,7 +9992,7 @@
         <w:sz w:val="16"/>
         <w:szCs w:val="16"/>
       </w:rPr>
-      <w:t xml:space="preserve">Rhythm Box — Algorithmic Audio Platform &amp; DSA Showcase</w:t>
+      <w:t xml:space="preserve">Rhythm Box — Algorithmic Audio Platform &amp; DSA Showcase (Joint Project Report)</w:t>
     </w:r>
   </w:p>
 </w:hdr>

</xml_diff>

<commit_message>
docs: add comprehensive spoken viva defense script and Q&A guide to project report docx and markdown
</commit_message>
<xml_diff>
--- a/DSA_Spotify_Project_Report.docx
+++ b/DSA_Spotify_Project_Report.docx
@@ -7972,7 +7972,7 @@
           <w:sz w:val="26"/>
           <w:szCs w:val="26"/>
         </w:rPr>
-        <w:t xml:space="preserve">3.2 Video Presentation Script &amp; Timestamp Log (Dual-Speaker)</w:t>
+        <w:t xml:space="preserve">3.2 Chronological Video Script &amp; Timestamp Log</w:t>
       </w:r>
     </w:p>
     <w:p>
@@ -9627,7 +9627,7 @@
           <w:sz w:val="26"/>
           <w:szCs w:val="26"/>
         </w:rPr>
-        <w:t xml:space="preserve">3.3 Evaluation Summary &amp; Self-Assessment</w:t>
+        <w:t xml:space="preserve">3.3 Verbatim Spoken Presentation &amp; Live Meeting Dialogue Script</w:t>
       </w:r>
     </w:p>
     <w:p>
@@ -9644,7 +9644,1259 @@
           <w:sz w:val="22"/>
           <w:szCs w:val="22"/>
         </w:rPr>
-        <w:t xml:space="preserve">The demonstration video comprehensively verifies that our collaborative project Rhythm Box successfully fulfills all academic, algorithmic, and software engineering criteria for the CS-302 laboratory project. All 8 custom data structures operate harmoniously without regression, producing a responsive, educational, and mathematically rigorous music player.</w:t>
+        <w:t xml:space="preserve">The following word-for-word transcript represents the exact spoken dialogue delivered by both presenters during the evaluation meeting. It includes explicit screen action cues and technical talking points:</w:t>
+      </w:r>
+    </w:p>
+    <w:p>
+      <w:pPr>
+        <w:pStyle w:val="Heading3"/>
+        <w:spacing w:after="100" w:before="180"/>
+      </w:pPr>
+      <w:r>
+        <w:rPr>
+          <w:rFonts w:ascii="Arial" w:cs="Arial" w:eastAsia="Arial" w:hAnsi="Arial"/>
+          <w:b/>
+          <w:bCs/>
+          <w:color w:val="15803D"/>
+          <w:sz w:val="22"/>
+          <w:szCs w:val="22"/>
+        </w:rPr>
+        <w:t xml:space="preserve">Phase 1: Welcome &amp; Joint Introduction (00:00 - 00:45)</w:t>
+      </w:r>
+    </w:p>
+    <w:p>
+      <w:pPr>
+        <w:spacing w:after="80" w:before="80"/>
+      </w:pPr>
+      <w:r>
+        <w:rPr>
+          <w:rFonts w:ascii="Arial" w:cs="Arial" w:eastAsia="Arial" w:hAnsi="Arial"/>
+          <w:b/>
+          <w:bCs/>
+          <w:color w:val="64748B"/>
+          <w:sz w:val="20"/>
+          <w:szCs w:val="20"/>
+        </w:rPr>
+        <w:t xml:space="preserve">▶ [Live Screen Action]: </w:t>
+      </w:r>
+      <w:r>
+        <w:rPr>
+          <w:rFonts w:ascii="Arial" w:cs="Arial" w:eastAsia="Arial" w:hAnsi="Arial"/>
+          <w:color w:val="64748B"/>
+          <w:sz w:val="20"/>
+          <w:szCs w:val="20"/>
+        </w:rPr>
+        <w:t xml:space="preserve">Screen share displays the Rhythm Box application live at http://localhost:5173 with spinning vinyl turntable and active telemetry console.</w:t>
+      </w:r>
+    </w:p>
+    <w:p>
+      <w:pPr>
+        <w:spacing w:after="120" w:before="100"/>
+      </w:pPr>
+      <w:r>
+        <w:rPr>
+          <w:rFonts w:ascii="Arial" w:cs="Arial" w:eastAsia="Arial" w:hAnsi="Arial"/>
+          <w:b/>
+          <w:bCs/>
+          <w:color w:val="0F5132"/>
+          <w:sz w:val="21"/>
+          <w:szCs w:val="21"/>
+        </w:rPr>
+        <w:t xml:space="preserve">[Swarup Linge]: </w:t>
+      </w:r>
+      <w:r>
+        <w:rPr>
+          <w:rFonts w:ascii="Arial" w:cs="Arial" w:eastAsia="Arial" w:hAnsi="Arial"/>
+          <w:color w:val="0F172A"/>
+          <w:sz w:val="21"/>
+          <w:szCs w:val="21"/>
+        </w:rPr>
+        <w:t xml:space="preserve">"Good morning / afternoon, respected professors and evaluation committee members. My name is Swarup Linge (Roll Number: 24, SAP ID: 70012023001), and alongside my project partner and co-developer [Partner Name], we are excited to present our CS-302 laboratory project: Rhythm Box: Algorithmic Audio Platform &amp; DSA Showcase."</w:t>
+      </w:r>
+    </w:p>
+    <w:p>
+      <w:pPr>
+        <w:spacing w:after="120" w:before="100"/>
+      </w:pPr>
+      <w:r>
+        <w:rPr>
+          <w:rFonts w:ascii="Arial" w:cs="Arial" w:eastAsia="Arial" w:hAnsi="Arial"/>
+          <w:b/>
+          <w:bCs/>
+          <w:color w:val="15803D"/>
+          <w:sz w:val="21"/>
+          <w:szCs w:val="21"/>
+        </w:rPr>
+        <w:t xml:space="preserve">[Project Partner]: </w:t>
+      </w:r>
+      <w:r>
+        <w:rPr>
+          <w:rFonts w:ascii="Arial" w:cs="Arial" w:eastAsia="Arial" w:hAnsi="Arial"/>
+          <w:color w:val="0F172A"/>
+          <w:sz w:val="21"/>
+          <w:szCs w:val="21"/>
+        </w:rPr>
+        <w:t xml:space="preserve">"Before we demonstrate our live platform, let us highlight the core motivation behind our work. Modern multimedia streaming applications like Spotify and Apple Music handle thousands of rapid catalog interactions per second. In standard web development, engineers routinely take shortcuts using high-level JavaScript array methods—such as Array.shift(), filter(), or linear find(). In a music catalog with tens of thousands of tracks, an array shift or un-indexed search incurs an O(N) linear time penalty, causing frame drops below the 60 FPS standard and audio buffer under-runs."</w:t>
+      </w:r>
+    </w:p>
+    <w:p>
+      <w:pPr>
+        <w:spacing w:after="120" w:before="100"/>
+      </w:pPr>
+      <w:r>
+        <w:rPr>
+          <w:rFonts w:ascii="Arial" w:cs="Arial" w:eastAsia="Arial" w:hAnsi="Arial"/>
+          <w:b/>
+          <w:bCs/>
+          <w:color w:val="0F5132"/>
+          <w:sz w:val="21"/>
+          <w:szCs w:val="21"/>
+        </w:rPr>
+        <w:t xml:space="preserve">[Swarup Linge]: </w:t>
+      </w:r>
+      <w:r>
+        <w:rPr>
+          <w:rFonts w:ascii="Arial" w:cs="Arial" w:eastAsia="Arial" w:hAnsi="Arial"/>
+          <w:color w:val="0F172A"/>
+          <w:sz w:val="21"/>
+          <w:szCs w:val="21"/>
+        </w:rPr>
+        <w:t xml:space="preserve">"To solve this computational bottleneck, our team established a strict foundational mandate: Zero native array method shortcuts for core operations. Every single user action—from next/prev track switching and FIFO queue scheduling, to character-by-character search autocomplete, dynamic trending charts, and similarity recommendations—is powered by custom, zero-dependency Data Structures and Algorithms classes engineered by our team in pure vanilla TypeScript."</w:t>
+      </w:r>
+    </w:p>
+    <w:p>
+      <w:pPr>
+        <w:pStyle w:val="Heading3"/>
+        <w:spacing w:after="100" w:before="180"/>
+      </w:pPr>
+      <w:r>
+        <w:rPr>
+          <w:rFonts w:ascii="Arial" w:cs="Arial" w:eastAsia="Arial" w:hAnsi="Arial"/>
+          <w:b/>
+          <w:bCs/>
+          <w:color w:val="15803D"/>
+          <w:sz w:val="22"/>
+          <w:szCs w:val="22"/>
+        </w:rPr>
+        <w:t xml:space="preserve">Phase 2: Playlist Navigation Engine — Doubly Linked List &amp; FIFO Queue (00:45 - 02:00)</w:t>
+      </w:r>
+    </w:p>
+    <w:p>
+      <w:pPr>
+        <w:spacing w:after="80" w:before="80"/>
+      </w:pPr>
+      <w:r>
+        <w:rPr>
+          <w:rFonts w:ascii="Arial" w:cs="Arial" w:eastAsia="Arial" w:hAnsi="Arial"/>
+          <w:b/>
+          <w:bCs/>
+          <w:color w:val="64748B"/>
+          <w:sz w:val="20"/>
+          <w:szCs w:val="20"/>
+        </w:rPr>
+        <w:t xml:space="preserve">▶ [Live Screen Action]: </w:t>
+      </w:r>
+      <w:r>
+        <w:rPr>
+          <w:rFonts w:ascii="Arial" w:cs="Arial" w:eastAsia="Arial" w:hAnsi="Arial"/>
+          <w:color w:val="64748B"/>
+          <w:sz w:val="20"/>
+          <w:szCs w:val="20"/>
+        </w:rPr>
+        <w:t xml:space="preserve">Swarup hovers mouse over the left Player Deck, pointing out the Doubly Linked List Pointer Telemetry HUD displaying active prev, current, and next pointers.</w:t>
+      </w:r>
+    </w:p>
+    <w:p>
+      <w:pPr>
+        <w:spacing w:after="120" w:before="100"/>
+      </w:pPr>
+      <w:r>
+        <w:rPr>
+          <w:rFonts w:ascii="Arial" w:cs="Arial" w:eastAsia="Arial" w:hAnsi="Arial"/>
+          <w:b/>
+          <w:bCs/>
+          <w:color w:val="0F5132"/>
+          <w:sz w:val="21"/>
+          <w:szCs w:val="21"/>
+        </w:rPr>
+        <w:t xml:space="preserve">[Swarup Linge]: </w:t>
+      </w:r>
+      <w:r>
+        <w:rPr>
+          <w:rFonts w:ascii="Arial" w:cs="Arial" w:eastAsia="Arial" w:hAnsi="Arial"/>
+          <w:color w:val="0F172A"/>
+          <w:sz w:val="21"/>
+          <w:szCs w:val="21"/>
+        </w:rPr>
+        <w:t xml:space="preserve">"Let us demonstrate our primary playback engine. Notice our live Doubly Linked List Pointer HUD on the transport console. Currently, the track "Binary Sunset" is playing. The HUD displays prev pointer: null (Head) and next pointer: Adjacency Matrix Blues. In DoublyLinkedList.ts, we engineered a custom SongNode class with explicit prev and next pointers. When I click the Next Track button—observe the console toast: DoublyLinkedList.getNext() ran in strictly O(1) constant time. We do not perform index arithmetic or scan an array; we simply dereference the active node's current.next pointer. Even if our catalog scaled to 10 million songs, transition latency remains instantaneous."</w:t>
+      </w:r>
+    </w:p>
+    <w:p>
+      <w:pPr>
+        <w:spacing w:after="80" w:before="80"/>
+      </w:pPr>
+      <w:r>
+        <w:rPr>
+          <w:rFonts w:ascii="Arial" w:cs="Arial" w:eastAsia="Arial" w:hAnsi="Arial"/>
+          <w:b/>
+          <w:bCs/>
+          <w:color w:val="64748B"/>
+          <w:sz w:val="20"/>
+          <w:szCs w:val="20"/>
+        </w:rPr>
+        <w:t xml:space="preserve">▶ [Live Screen Action]: </w:t>
+      </w:r>
+      <w:r>
+        <w:rPr>
+          <w:rFonts w:ascii="Arial" w:cs="Arial" w:eastAsia="Arial" w:hAnsi="Arial"/>
+          <w:color w:val="64748B"/>
+          <w:sz w:val="20"/>
+          <w:szCs w:val="20"/>
+        </w:rPr>
+        <w:t xml:space="preserve">Partner takes control of the cursor, clicks "Add to Queue" on track 7 and track 10, then reveals the Up Next FIFO drawer.</w:t>
+      </w:r>
+    </w:p>
+    <w:p>
+      <w:pPr>
+        <w:spacing w:after="120" w:before="100"/>
+      </w:pPr>
+      <w:r>
+        <w:rPr>
+          <w:rFonts w:ascii="Arial" w:cs="Arial" w:eastAsia="Arial" w:hAnsi="Arial"/>
+          <w:b/>
+          <w:bCs/>
+          <w:color w:val="15803D"/>
+          <w:sz w:val="21"/>
+          <w:szCs w:val="21"/>
+        </w:rPr>
+        <w:t xml:space="preserve">[Project Partner]: </w:t>
+      </w:r>
+      <w:r>
+        <w:rPr>
+          <w:rFonts w:ascii="Arial" w:cs="Arial" w:eastAsia="Arial" w:hAnsi="Arial"/>
+          <w:color w:val="0F172A"/>
+          <w:sz w:val="21"/>
+          <w:szCs w:val="21"/>
+        </w:rPr>
+        <w:t xml:space="preserve">"Working in harmony with the playlist is our "Up Next" FIFO Queue, implemented in Queue.ts. Rather than using an array push() and shift() (which would cause expensive O(N) element re-indexing), we built a true pointer-based linked Queue with explicit head (front) and tail (rear) references. As you see on screen, enqueuing tracks runs in strictly O(1) time. The queue drawer currently displays "FRONT: Depth-First Serenade" followed by "#2: Shortest Path To You". Crucially, when the currently playing track finishes, our playback listener checks queue.isEmpty(). If false, queue.dequeue() extracts the front track in O(1) and plays it before resuming default Doubly Linked List traversal."</w:t>
+      </w:r>
+    </w:p>
+    <w:p>
+      <w:pPr>
+        <w:pStyle w:val="Heading3"/>
+        <w:spacing w:after="100" w:before="180"/>
+      </w:pPr>
+      <w:r>
+        <w:rPr>
+          <w:rFonts w:ascii="Arial" w:cs="Arial" w:eastAsia="Arial" w:hAnsi="Arial"/>
+          <w:b/>
+          <w:bCs/>
+          <w:color w:val="15803D"/>
+          <w:sz w:val="22"/>
+          <w:szCs w:val="22"/>
+        </w:rPr>
+        <w:t xml:space="preserve">Phase 3: Search Engine Autocomplete (Trie) &amp; Favorites (Custom Hash Map) (02:00 - 03:15)</w:t>
+      </w:r>
+    </w:p>
+    <w:p>
+      <w:pPr>
+        <w:spacing w:after="80" w:before="80"/>
+      </w:pPr>
+      <w:r>
+        <w:rPr>
+          <w:rFonts w:ascii="Arial" w:cs="Arial" w:eastAsia="Arial" w:hAnsi="Arial"/>
+          <w:b/>
+          <w:bCs/>
+          <w:color w:val="64748B"/>
+          <w:sz w:val="20"/>
+          <w:szCs w:val="20"/>
+        </w:rPr>
+        <w:t xml:space="preserve">▶ [Live Screen Action]: </w:t>
+      </w:r>
+      <w:r>
+        <w:rPr>
+          <w:rFonts w:ascii="Arial" w:cs="Arial" w:eastAsia="Arial" w:hAnsi="Arial"/>
+          <w:color w:val="64748B"/>
+          <w:sz w:val="20"/>
+          <w:szCs w:val="20"/>
+        </w:rPr>
+        <w:t xml:space="preserve">Swarup clicks the Search Terminal at the top and types "a-l-g-o" character by character.</w:t>
+      </w:r>
+    </w:p>
+    <w:p>
+      <w:pPr>
+        <w:spacing w:after="120" w:before="100"/>
+      </w:pPr>
+      <w:r>
+        <w:rPr>
+          <w:rFonts w:ascii="Arial" w:cs="Arial" w:eastAsia="Arial" w:hAnsi="Arial"/>
+          <w:b/>
+          <w:bCs/>
+          <w:color w:val="0F5132"/>
+          <w:sz w:val="21"/>
+          <w:szCs w:val="21"/>
+        </w:rPr>
+        <w:t xml:space="preserve">[Swarup Linge]: </w:t>
+      </w:r>
+      <w:r>
+        <w:rPr>
+          <w:rFonts w:ascii="Arial" w:cs="Arial" w:eastAsia="Arial" w:hAnsi="Arial"/>
+          <w:color w:val="0F172A"/>
+          <w:sz w:val="21"/>
+          <w:szCs w:val="21"/>
+        </w:rPr>
+        <w:t xml:space="preserve">"Now, let us examine our instant search terminal. A naive linear scan across thousands of songs would take O(N * M) string comparisons. In Trie.ts, we engineered a 26-ary character Prefix Tree (Trie). Every song title, artist name, and genre tag is tokenized and inserted into the Trie during initialization. As I type "a-l-g-o", notice the telemetry badge in the terminal: Lookup Time: 0.31 milliseconds! The Trie traverses from the root down through the prefix nodes in strictly O(L) time, where L is merely the length of the query string (4 characters!). It then collects all candidate song IDs below that node. Search response time is completely independent of catalog size."</w:t>
+      </w:r>
+    </w:p>
+    <w:p>
+      <w:pPr>
+        <w:spacing w:after="80" w:before="80"/>
+      </w:pPr>
+      <w:r>
+        <w:rPr>
+          <w:rFonts w:ascii="Arial" w:cs="Arial" w:eastAsia="Arial" w:hAnsi="Arial"/>
+          <w:b/>
+          <w:bCs/>
+          <w:color w:val="64748B"/>
+          <w:sz w:val="20"/>
+          <w:szCs w:val="20"/>
+        </w:rPr>
+        <w:t xml:space="preserve">▶ [Live Screen Action]: </w:t>
+      </w:r>
+      <w:r>
+        <w:rPr>
+          <w:rFonts w:ascii="Arial" w:cs="Arial" w:eastAsia="Arial" w:hAnsi="Arial"/>
+          <w:color w:val="64748B"/>
+          <w:sz w:val="20"/>
+          <w:szCs w:val="20"/>
+        </w:rPr>
+        <w:t xml:space="preserve">Partner hovers over the playlist table, clicking the heart icons on multiple tracks.</w:t>
+      </w:r>
+    </w:p>
+    <w:p>
+      <w:pPr>
+        <w:spacing w:after="120" w:before="100"/>
+      </w:pPr>
+      <w:r>
+        <w:rPr>
+          <w:rFonts w:ascii="Arial" w:cs="Arial" w:eastAsia="Arial" w:hAnsi="Arial"/>
+          <w:b/>
+          <w:bCs/>
+          <w:color w:val="15803D"/>
+          <w:sz w:val="21"/>
+          <w:szCs w:val="21"/>
+        </w:rPr>
+        <w:t xml:space="preserve">[Project Partner]: </w:t>
+      </w:r>
+      <w:r>
+        <w:rPr>
+          <w:rFonts w:ascii="Arial" w:cs="Arial" w:eastAsia="Arial" w:hAnsi="Arial"/>
+          <w:color w:val="0F172A"/>
+          <w:sz w:val="21"/>
+          <w:szCs w:val="21"/>
+        </w:rPr>
+        <w:t xml:space="preserve">"To complement the Trie, how do we retrieve song metadata and track user "Favorites" in constant time? In CustomHashMap.ts, we implemented our own Hash Table from scratch. We chose the renowned djb2 polynomial rolling hash algorithm with a prime bucket capacity of 23 and separate chaining linked lists for collision resolution. When I click the heart icon on any track, map.put(songId, true) hashes the string ID, maps it to a bucket, and stores the state in O(1) average time. Toggling favorites and retrieving song metadata bypasses all table scans."</w:t>
+      </w:r>
+    </w:p>
+    <w:p>
+      <w:pPr>
+        <w:pStyle w:val="Heading3"/>
+        <w:spacing w:after="100" w:before="180"/>
+      </w:pPr>
+      <w:r>
+        <w:rPr>
+          <w:rFonts w:ascii="Arial" w:cs="Arial" w:eastAsia="Arial" w:hAnsi="Arial"/>
+          <w:b/>
+          <w:bCs/>
+          <w:color w:val="15803D"/>
+          <w:sz w:val="22"/>
+          <w:szCs w:val="22"/>
+        </w:rPr>
+        <w:t xml:space="preserve">Phase 4: Dynamic Top Charts (Binary Max-Heap) &amp; In-Place Sorting (03:15 - 04:30)</w:t>
+      </w:r>
+    </w:p>
+    <w:p>
+      <w:pPr>
+        <w:spacing w:after="80" w:before="80"/>
+      </w:pPr>
+      <w:r>
+        <w:rPr>
+          <w:rFonts w:ascii="Arial" w:cs="Arial" w:eastAsia="Arial" w:hAnsi="Arial"/>
+          <w:b/>
+          <w:bCs/>
+          <w:color w:val="64748B"/>
+          <w:sz w:val="20"/>
+          <w:szCs w:val="20"/>
+        </w:rPr>
+        <w:t xml:space="preserve">▶ [Live Screen Action]: </w:t>
+      </w:r>
+      <w:r>
+        <w:rPr>
+          <w:rFonts w:ascii="Arial" w:cs="Arial" w:eastAsia="Arial" w:hAnsi="Arial"/>
+          <w:color w:val="64748B"/>
+          <w:sz w:val="20"/>
+          <w:szCs w:val="20"/>
+        </w:rPr>
+        <w:t xml:space="preserve">Partner plays track 4 repeatedly, pointing to the Top 5 Charts leaderboard as it automatically reorders in real-time.</w:t>
+      </w:r>
+    </w:p>
+    <w:p>
+      <w:pPr>
+        <w:spacing w:after="120" w:before="100"/>
+      </w:pPr>
+      <w:r>
+        <w:rPr>
+          <w:rFonts w:ascii="Arial" w:cs="Arial" w:eastAsia="Arial" w:hAnsi="Arial"/>
+          <w:b/>
+          <w:bCs/>
+          <w:color w:val="15803D"/>
+          <w:sz w:val="21"/>
+          <w:szCs w:val="21"/>
+        </w:rPr>
+        <w:t xml:space="preserve">[Project Partner]: </w:t>
+      </w:r>
+      <w:r>
+        <w:rPr>
+          <w:rFonts w:ascii="Arial" w:cs="Arial" w:eastAsia="Arial" w:hAnsi="Arial"/>
+          <w:color w:val="0F172A"/>
+          <w:sz w:val="21"/>
+          <w:szCs w:val="21"/>
+        </w:rPr>
+        <w:t xml:space="preserve">"Now let us turn to our live analytics engine: the Top 5 Charts Leaderboard. In commercial applications, computing top-played tracks cannot afford an O(N log N) full-catalog sort on every song play. In MaxHeap.ts, we engineered a Binary Max-Heap keyed by each track's playCount. When track 4 is played, heap.updateSongPlayCount() increments its counter and immediately triggers siftUp(). This bubbles the song up the complete binary tree in strictly O(log N) time. As you just witnessed on screen, track 4 automatically climbed from rank 5 to rank 2 in real-time, preserving the max-heap invariant with minimal CPU overhead."</w:t>
+      </w:r>
+    </w:p>
+    <w:p>
+      <w:pPr>
+        <w:spacing w:after="80" w:before="80"/>
+      </w:pPr>
+      <w:r>
+        <w:rPr>
+          <w:rFonts w:ascii="Arial" w:cs="Arial" w:eastAsia="Arial" w:hAnsi="Arial"/>
+          <w:b/>
+          <w:bCs/>
+          <w:color w:val="64748B"/>
+          <w:sz w:val="20"/>
+          <w:szCs w:val="20"/>
+        </w:rPr>
+        <w:t xml:space="preserve">▶ [Live Screen Action]: </w:t>
+      </w:r>
+      <w:r>
+        <w:rPr>
+          <w:rFonts w:ascii="Arial" w:cs="Arial" w:eastAsia="Arial" w:hAnsi="Arial"/>
+          <w:color w:val="64748B"/>
+          <w:sz w:val="20"/>
+          <w:szCs w:val="20"/>
+        </w:rPr>
+        <w:t xml:space="preserve">Swarup points to the sort dropdown in the playlist table header, selecting "QuickSort" and then "MergeSort".</w:t>
+      </w:r>
+    </w:p>
+    <w:p>
+      <w:pPr>
+        <w:spacing w:after="120" w:before="100"/>
+      </w:pPr>
+      <w:r>
+        <w:rPr>
+          <w:rFonts w:ascii="Arial" w:cs="Arial" w:eastAsia="Arial" w:hAnsi="Arial"/>
+          <w:b/>
+          <w:bCs/>
+          <w:color w:val="0F5132"/>
+          <w:sz w:val="21"/>
+          <w:szCs w:val="21"/>
+        </w:rPr>
+        <w:t xml:space="preserve">[Swarup Linge]: </w:t>
+      </w:r>
+      <w:r>
+        <w:rPr>
+          <w:rFonts w:ascii="Arial" w:cs="Arial" w:eastAsia="Arial" w:hAnsi="Arial"/>
+          <w:color w:val="0F172A"/>
+          <w:sz w:val="21"/>
+          <w:szCs w:val="21"/>
+        </w:rPr>
+        <w:t xml:space="preserve">"For explicit user-driven catalog reordering, we implemented two classical sorting algorithms in SortingAlgorithms.ts. When I select "QuickSort", the algorithm partitions our playlist alphabetically by Title using the in-place Lomuto partition scheme in O(N log N) average time. Observe the live execution badge displaying the exact comparisons (28 comparisons) and time elapsed (0.42 ms). When I select "MergeSort", the engine stably divides and merges the array numerically by song Duration. Furthermore, before any sort executes, our engine pushes an inverse command onto an Undo stack, making all sorts reversible."</w:t>
+      </w:r>
+    </w:p>
+    <w:p>
+      <w:pPr>
+        <w:pStyle w:val="Heading3"/>
+        <w:spacing w:after="100" w:before="180"/>
+      </w:pPr>
+      <w:r>
+        <w:rPr>
+          <w:rFonts w:ascii="Arial" w:cs="Arial" w:eastAsia="Arial" w:hAnsi="Arial"/>
+          <w:b/>
+          <w:bCs/>
+          <w:color w:val="15803D"/>
+          <w:sz w:val="22"/>
+          <w:szCs w:val="22"/>
+        </w:rPr>
+        <w:t xml:space="preserve">Phase 5: Song Recommendations &amp; Visual Similarity Graph (BFS) (04:30 - 05:30)</w:t>
+      </w:r>
+    </w:p>
+    <w:p>
+      <w:pPr>
+        <w:spacing w:after="80" w:before="80"/>
+      </w:pPr>
+      <w:r>
+        <w:rPr>
+          <w:rFonts w:ascii="Arial" w:cs="Arial" w:eastAsia="Arial" w:hAnsi="Arial"/>
+          <w:b/>
+          <w:bCs/>
+          <w:color w:val="64748B"/>
+          <w:sz w:val="20"/>
+          <w:szCs w:val="20"/>
+        </w:rPr>
+        <w:t xml:space="preserve">▶ [Live Screen Action]: </w:t>
+      </w:r>
+      <w:r>
+        <w:rPr>
+          <w:rFonts w:ascii="Arial" w:cs="Arial" w:eastAsia="Arial" w:hAnsi="Arial"/>
+          <w:color w:val="64748B"/>
+          <w:sz w:val="20"/>
+          <w:szCs w:val="20"/>
+        </w:rPr>
+        <w:t xml:space="preserve">Partner selects an ambient track, points to the "Recommended For You" shelf, and clicks "Show Song Relationship Graph".</w:t>
+      </w:r>
+    </w:p>
+    <w:p>
+      <w:pPr>
+        <w:spacing w:after="120" w:before="100"/>
+      </w:pPr>
+      <w:r>
+        <w:rPr>
+          <w:rFonts w:ascii="Arial" w:cs="Arial" w:eastAsia="Arial" w:hAnsi="Arial"/>
+          <w:b/>
+          <w:bCs/>
+          <w:color w:val="15803D"/>
+          <w:sz w:val="21"/>
+          <w:szCs w:val="21"/>
+        </w:rPr>
+        <w:t xml:space="preserve">[Project Partner]: </w:t>
+      </w:r>
+      <w:r>
+        <w:rPr>
+          <w:rFonts w:ascii="Arial" w:cs="Arial" w:eastAsia="Arial" w:hAnsi="Arial"/>
+          <w:color w:val="0F172A"/>
+          <w:sz w:val="21"/>
+          <w:szCs w:val="21"/>
+        </w:rPr>
+        <w:t xml:space="preserve">"Music discovery is powered by graph theory. In Graph.ts, we modeled our music catalog as an undirected weighted Graph using an Adjacency List. Vertices represent individual songs, while edges connect songs that share acoustic features—such as genre classification, BPM tempo proximity, and harmonic release era."</w:t>
+      </w:r>
+    </w:p>
+    <w:p>
+      <w:pPr>
+        <w:spacing w:after="80" w:before="80"/>
+      </w:pPr>
+      <w:r>
+        <w:rPr>
+          <w:rFonts w:ascii="Arial" w:cs="Arial" w:eastAsia="Arial" w:hAnsi="Arial"/>
+          <w:b/>
+          <w:bCs/>
+          <w:color w:val="64748B"/>
+          <w:sz w:val="20"/>
+          <w:szCs w:val="20"/>
+        </w:rPr>
+        <w:t xml:space="preserve">▶ [Live Screen Action]: </w:t>
+      </w:r>
+      <w:r>
+        <w:rPr>
+          <w:rFonts w:ascii="Arial" w:cs="Arial" w:eastAsia="Arial" w:hAnsi="Arial"/>
+          <w:color w:val="64748B"/>
+          <w:sz w:val="20"/>
+          <w:szCs w:val="20"/>
+        </w:rPr>
+        <w:t xml:space="preserve">The interactive SVG Graph Modal opens, showing nodes with pulsating borders and similarity edges.</w:t>
+      </w:r>
+    </w:p>
+    <w:p>
+      <w:pPr>
+        <w:spacing w:after="120" w:before="100"/>
+      </w:pPr>
+      <w:r>
+        <w:rPr>
+          <w:rFonts w:ascii="Arial" w:cs="Arial" w:eastAsia="Arial" w:hAnsi="Arial"/>
+          <w:b/>
+          <w:bCs/>
+          <w:color w:val="0F5132"/>
+          <w:sz w:val="21"/>
+          <w:szCs w:val="21"/>
+        </w:rPr>
+        <w:t xml:space="preserve">[Swarup Linge]: </w:t>
+      </w:r>
+      <w:r>
+        <w:rPr>
+          <w:rFonts w:ascii="Arial" w:cs="Arial" w:eastAsia="Arial" w:hAnsi="Arial"/>
+          <w:color w:val="0F172A"/>
+          <w:sz w:val="21"/>
+          <w:szCs w:val="21"/>
+        </w:rPr>
+        <w:t xml:space="preserve">"When a track plays, our recommendation engine initiates Breadth-First Search (BFS) starting from the active song vertex, powered by our custom Queue. BFS explores neighboring nodes up to 2 hops of depth in strictly O(V + E) time. This guarantees that recommendations reflect genuine acoustic similarity without expensive all-pairs shortest path calculations. On screen, you can see the interactive SVG graph visualizer rendering the central song node and its connected acoustic neighbors."</w:t>
+      </w:r>
+    </w:p>
+    <w:p>
+      <w:pPr>
+        <w:pStyle w:val="Heading3"/>
+        <w:spacing w:after="100" w:before="180"/>
+      </w:pPr>
+      <w:r>
+        <w:rPr>
+          <w:rFonts w:ascii="Arial" w:cs="Arial" w:eastAsia="Arial" w:hAnsi="Arial"/>
+          <w:b/>
+          <w:bCs/>
+          <w:color w:val="15803D"/>
+          <w:sz w:val="22"/>
+          <w:szCs w:val="22"/>
+        </w:rPr>
+        <w:t xml:space="preserve">Phase 6: Audio Engineering &amp; Live Track Ingestion Demo (Showstopper) (05:30 - 06:15)</w:t>
+      </w:r>
+    </w:p>
+    <w:p>
+      <w:pPr>
+        <w:spacing w:after="80" w:before="80"/>
+      </w:pPr>
+      <w:r>
+        <w:rPr>
+          <w:rFonts w:ascii="Arial" w:cs="Arial" w:eastAsia="Arial" w:hAnsi="Arial"/>
+          <w:b/>
+          <w:bCs/>
+          <w:color w:val="64748B"/>
+          <w:sz w:val="20"/>
+          <w:szCs w:val="20"/>
+        </w:rPr>
+        <w:t xml:space="preserve">▶ [Live Screen Action]: </w:t>
+      </w:r>
+      <w:r>
+        <w:rPr>
+          <w:rFonts w:ascii="Arial" w:cs="Arial" w:eastAsia="Arial" w:hAnsi="Arial"/>
+          <w:color w:val="64748B"/>
+          <w:sz w:val="20"/>
+          <w:szCs w:val="20"/>
+        </w:rPr>
+        <w:t xml:space="preserve">Swarup highlights the audio transport deck and the HTML5 Direct status badge.</w:t>
+      </w:r>
+    </w:p>
+    <w:p>
+      <w:pPr>
+        <w:spacing w:after="120" w:before="100"/>
+      </w:pPr>
+      <w:r>
+        <w:rPr>
+          <w:rFonts w:ascii="Arial" w:cs="Arial" w:eastAsia="Arial" w:hAnsi="Arial"/>
+          <w:b/>
+          <w:bCs/>
+          <w:color w:val="0F5132"/>
+          <w:sz w:val="21"/>
+          <w:szCs w:val="21"/>
+        </w:rPr>
+        <w:t xml:space="preserve">[Swarup Linge]: </w:t>
+      </w:r>
+      <w:r>
+        <w:rPr>
+          <w:rFonts w:ascii="Arial" w:cs="Arial" w:eastAsia="Arial" w:hAnsi="Arial"/>
+          <w:color w:val="0F172A"/>
+          <w:sz w:val="21"/>
+          <w:szCs w:val="21"/>
+        </w:rPr>
+        <w:t xml:space="preserve">"For audio playback, we built a dual-backend AudioEngine.ts. All 12 mock songs are bundled locally inside public/audio/song-X.mp3, ensuring 100% offline functionality with zero CORS restrictions or external CDN dependencies. Should browser audio permissions or hardware fail, the engine gracefully fails over to a Web Audio API Oscillator Synthesizer that produces melodic chords."</w:t>
+      </w:r>
+    </w:p>
+    <w:p>
+      <w:pPr>
+        <w:spacing w:after="80" w:before="80"/>
+      </w:pPr>
+      <w:r>
+        <w:rPr>
+          <w:rFonts w:ascii="Arial" w:cs="Arial" w:eastAsia="Arial" w:hAnsi="Arial"/>
+          <w:b/>
+          <w:bCs/>
+          <w:color w:val="64748B"/>
+          <w:sz w:val="20"/>
+          <w:szCs w:val="20"/>
+        </w:rPr>
+        <w:t xml:space="preserve">▶ [Live Screen Action]: </w:t>
+      </w:r>
+      <w:r>
+        <w:rPr>
+          <w:rFonts w:ascii="Arial" w:cs="Arial" w:eastAsia="Arial" w:hAnsi="Arial"/>
+          <w:color w:val="64748B"/>
+          <w:sz w:val="20"/>
+          <w:szCs w:val="20"/>
+        </w:rPr>
+        <w:t xml:space="preserve">Partner clicks the prominent "Insert Audio File" button on the Player Deck, chooses a local MP3 file from the laptop.</w:t>
+      </w:r>
+    </w:p>
+    <w:p>
+      <w:pPr>
+        <w:spacing w:after="120" w:before="100"/>
+      </w:pPr>
+      <w:r>
+        <w:rPr>
+          <w:rFonts w:ascii="Arial" w:cs="Arial" w:eastAsia="Arial" w:hAnsi="Arial"/>
+          <w:b/>
+          <w:bCs/>
+          <w:color w:val="15803D"/>
+          <w:sz w:val="21"/>
+          <w:szCs w:val="21"/>
+        </w:rPr>
+        <w:t xml:space="preserve">[Project Partner]: </w:t>
+      </w:r>
+      <w:r>
+        <w:rPr>
+          <w:rFonts w:ascii="Arial" w:cs="Arial" w:eastAsia="Arial" w:hAnsi="Arial"/>
+          <w:color w:val="0F172A"/>
+          <w:sz w:val="21"/>
+          <w:szCs w:val="21"/>
+        </w:rPr>
+        <w:t xml:space="preserve">"Now, respected evaluators, watch our platform's showstopper feature: Live Audio Ingestion. I will click "Insert Audio File" and upload an MP3 file from my laptop. Watch the live toast and the console: In a single unified pipeline, this local file is loaded via URL.createObjectURL for zero-latency browser streaming, and it simultaneously propagates into all 8 custom DSA structures: (1) Appended to Doubly Linked List in O(1), (2) Indexed into Trie in O(L) for instant search, (3) Stored in Custom Hash Map in O(1), (4) Inserted into Binary Max-Heap in O(log N), and (5) Connected to the Similarity Graph in O(1). The vinyl turntable immediately begins spinning, visualizer bars bounce, and our uploaded song plays with full audio fidelity!"</w:t>
+      </w:r>
+    </w:p>
+    <w:p>
+      <w:pPr>
+        <w:pStyle w:val="Heading3"/>
+        <w:spacing w:after="100" w:before="180"/>
+      </w:pPr>
+      <w:r>
+        <w:rPr>
+          <w:rFonts w:ascii="Arial" w:cs="Arial" w:eastAsia="Arial" w:hAnsi="Arial"/>
+          <w:b/>
+          <w:bCs/>
+          <w:color w:val="15803D"/>
+          <w:sz w:val="22"/>
+          <w:szCs w:val="22"/>
+        </w:rPr>
+        <w:t xml:space="preserve">Phase 7: LIFO Undo Engine, Test Verification &amp; Closing (06:15 - 07:00)</w:t>
+      </w:r>
+    </w:p>
+    <w:p>
+      <w:pPr>
+        <w:spacing w:after="80" w:before="80"/>
+      </w:pPr>
+      <w:r>
+        <w:rPr>
+          <w:rFonts w:ascii="Arial" w:cs="Arial" w:eastAsia="Arial" w:hAnsi="Arial"/>
+          <w:b/>
+          <w:bCs/>
+          <w:color w:val="64748B"/>
+          <w:sz w:val="20"/>
+          <w:szCs w:val="20"/>
+        </w:rPr>
+        <w:t xml:space="preserve">▶ [Live Screen Action]: </w:t>
+      </w:r>
+      <w:r>
+        <w:rPr>
+          <w:rFonts w:ascii="Arial" w:cs="Arial" w:eastAsia="Arial" w:hAnsi="Arial"/>
+          <w:color w:val="64748B"/>
+          <w:sz w:val="20"/>
+          <w:szCs w:val="20"/>
+        </w:rPr>
+        <w:t xml:space="preserve">Swarup deletes a track from the library table, then clicks "Undo Last Action".</w:t>
+      </w:r>
+    </w:p>
+    <w:p>
+      <w:pPr>
+        <w:spacing w:after="120" w:before="100"/>
+      </w:pPr>
+      <w:r>
+        <w:rPr>
+          <w:rFonts w:ascii="Arial" w:cs="Arial" w:eastAsia="Arial" w:hAnsi="Arial"/>
+          <w:b/>
+          <w:bCs/>
+          <w:color w:val="0F5132"/>
+          <w:sz w:val="21"/>
+          <w:szCs w:val="21"/>
+        </w:rPr>
+        <w:t xml:space="preserve">[Swarup Linge]: </w:t>
+      </w:r>
+      <w:r>
+        <w:rPr>
+          <w:rFonts w:ascii="Arial" w:cs="Arial" w:eastAsia="Arial" w:hAnsi="Arial"/>
+          <w:color w:val="0F172A"/>
+          <w:sz w:val="21"/>
+          <w:szCs w:val="21"/>
+        </w:rPr>
+        <w:t xml:space="preserve">"Finally, we implemented the Command Pattern for library mutations in Stack.ts. When I click "Delete" on a song, Doubly Linked List unlinks the node in O(1), and an inverse command { type: "DELETE_SONG", payload: { song, index } } is pushed onto our Undo Stack. When I click "Undo Last Action", the stack pops the command in O(1), and dll.insertAt(index, song) restores the track at its exact original table index."</w:t>
+      </w:r>
+    </w:p>
+    <w:p>
+      <w:pPr>
+        <w:spacing w:after="80" w:before="80"/>
+      </w:pPr>
+      <w:r>
+        <w:rPr>
+          <w:rFonts w:ascii="Arial" w:cs="Arial" w:eastAsia="Arial" w:hAnsi="Arial"/>
+          <w:b/>
+          <w:bCs/>
+          <w:color w:val="64748B"/>
+          <w:sz w:val="20"/>
+          <w:szCs w:val="20"/>
+        </w:rPr>
+        <w:t xml:space="preserve">▶ [Live Screen Action]: </w:t>
+      </w:r>
+      <w:r>
+        <w:rPr>
+          <w:rFonts w:ascii="Arial" w:cs="Arial" w:eastAsia="Arial" w:hAnsi="Arial"/>
+          <w:color w:val="64748B"/>
+          <w:sz w:val="20"/>
+          <w:szCs w:val="20"/>
+        </w:rPr>
+        <w:t xml:space="preserve">Partner displays the Test Matrix and terminal build output.</w:t>
+      </w:r>
+    </w:p>
+    <w:p>
+      <w:pPr>
+        <w:spacing w:after="120" w:before="100"/>
+      </w:pPr>
+      <w:r>
+        <w:rPr>
+          <w:rFonts w:ascii="Arial" w:cs="Arial" w:eastAsia="Arial" w:hAnsi="Arial"/>
+          <w:b/>
+          <w:bCs/>
+          <w:color w:val="15803D"/>
+          <w:sz w:val="21"/>
+          <w:szCs w:val="21"/>
+        </w:rPr>
+        <w:t xml:space="preserve">[Project Partner]: </w:t>
+      </w:r>
+      <w:r>
+        <w:rPr>
+          <w:rFonts w:ascii="Arial" w:cs="Arial" w:eastAsia="Arial" w:hAnsi="Arial"/>
+          <w:color w:val="0F172A"/>
+          <w:sz w:val="21"/>
+          <w:szCs w:val="21"/>
+        </w:rPr>
+        <w:t xml:space="preserve">"We have rigorously verified Rhythm Box through an automated 14-test-case matrix covering edge boundaries, hash collisions, and heap invariants. All 14 test cases passed with 100% verification. Our production build is compressed to ~102 KB gzip, and RAM consumption during continuous 30-minute playback remains steady below 28 MB."</w:t>
+      </w:r>
+    </w:p>
+    <w:p>
+      <w:pPr>
+        <w:spacing w:after="120" w:before="100"/>
+      </w:pPr>
+      <w:r>
+        <w:rPr>
+          <w:rFonts w:ascii="Arial" w:cs="Arial" w:eastAsia="Arial" w:hAnsi="Arial"/>
+          <w:b/>
+          <w:bCs/>
+          <w:color w:val="0F5132"/>
+          <w:sz w:val="21"/>
+          <w:szCs w:val="21"/>
+        </w:rPr>
+        <w:t xml:space="preserve">[Swarup Linge]: </w:t>
+      </w:r>
+      <w:r>
+        <w:rPr>
+          <w:rFonts w:ascii="Arial" w:cs="Arial" w:eastAsia="Arial" w:hAnsi="Arial"/>
+          <w:color w:val="0F172A"/>
+          <w:sz w:val="21"/>
+          <w:szCs w:val="21"/>
+        </w:rPr>
+        <w:t xml:space="preserve">"In conclusion, Rhythm Box demonstrates that classical computer science data structures are not merely theoretical textbook concepts—they are the foundational building blocks of modern, responsive, high-performance multimedia applications. Thank you for your time and consideration. [Partner Name] and I are now delighted to answer any questions from the committee!"</w:t>
+      </w:r>
+    </w:p>
+    <w:p>
+      <w:pPr>
+        <w:pStyle w:val="Heading2"/>
+        <w:spacing w:after="140" w:before="260"/>
+      </w:pPr>
+      <w:r>
+        <w:rPr>
+          <w:rFonts w:ascii="Arial" w:cs="Arial" w:eastAsia="Arial" w:hAnsi="Arial"/>
+          <w:b/>
+          <w:bCs/>
+          <w:color w:val="0F172A"/>
+          <w:sz w:val="26"/>
+          <w:szCs w:val="26"/>
+        </w:rPr>
+        <w:t xml:space="preserve">3.4 Technical Viva Defense &amp; Evaluator Q&amp;A Guide</w:t>
+      </w:r>
+    </w:p>
+    <w:p>
+      <w:pPr>
+        <w:spacing w:after="120" w:before="0"/>
+        <w:jc w:val="left"/>
+      </w:pPr>
+      <w:r>
+        <w:rPr>
+          <w:rFonts w:ascii="Arial" w:cs="Arial" w:eastAsia="Arial" w:hAnsi="Arial"/>
+          <w:b w:val="false"/>
+          <w:bCs w:val="false"/>
+          <w:color w:val="334155"/>
+          <w:sz w:val="22"/>
+          <w:szCs w:val="22"/>
+        </w:rPr>
+        <w:t xml:space="preserve">The following guide details the top 10 anticipated technical questions from evaluators and the exact theoretical and empirical defense formulated by our team:</w:t>
+      </w:r>
+    </w:p>
+    <w:p>
+      <w:pPr>
+        <w:spacing w:after="120" w:before="0"/>
+        <w:jc w:val="left"/>
+      </w:pPr>
+      <w:r>
+        <w:rPr>
+          <w:rFonts w:ascii="Arial" w:cs="Arial" w:eastAsia="Arial" w:hAnsi="Arial"/>
+          <w:b/>
+          <w:bCs/>
+          <w:color w:val="0F172A"/>
+          <w:sz w:val="22"/>
+          <w:szCs w:val="22"/>
+        </w:rPr>
+        <w:t xml:space="preserve">Q1: Why use a Doubly Linked List instead of an Array for the playlist?</w:t>
+      </w:r>
+    </w:p>
+    <w:p>
+      <w:pPr>
+        <w:spacing w:after="120" w:before="0"/>
+        <w:jc w:val="left"/>
+      </w:pPr>
+      <w:r>
+        <w:rPr>
+          <w:rFonts w:ascii="Arial" w:cs="Arial" w:eastAsia="Arial" w:hAnsi="Arial"/>
+          <w:b w:val="false"/>
+          <w:bCs w:val="false"/>
+          <w:color w:val="334155"/>
+          <w:sz w:val="22"/>
+          <w:szCs w:val="22"/>
+        </w:rPr>
+        <w:t xml:space="preserve">Defense (Swarup Linge): "In an Array, calling shift() or inserting/deleting elements at arbitrary positions requires shifting N-1 elements in contiguous memory, which is O(N). In our Doubly Linked List, each SongNode holds direct reference pointers (prev and next). Traversal to the next or previous track is strictly O(1) pointer dereferencing with zero memory relocation, providing deterministic sub-millisecond transition latency regardless of catalog size."</w:t>
+      </w:r>
+    </w:p>
+    <w:p>
+      <w:pPr>
+        <w:spacing w:after="120" w:before="0"/>
+        <w:jc w:val="left"/>
+      </w:pPr>
+      <w:r>
+        <w:rPr>
+          <w:rFonts w:ascii="Arial" w:cs="Arial" w:eastAsia="Arial" w:hAnsi="Arial"/>
+          <w:b/>
+          <w:bCs/>
+          <w:color w:val="0F172A"/>
+          <w:sz w:val="22"/>
+          <w:szCs w:val="22"/>
+        </w:rPr>
+        <w:t xml:space="preserve">Q2: How does your Custom HashMap handle hash collisions?</w:t>
+      </w:r>
+    </w:p>
+    <w:p>
+      <w:pPr>
+        <w:spacing w:after="120" w:before="0"/>
+        <w:jc w:val="left"/>
+      </w:pPr>
+      <w:r>
+        <w:rPr>
+          <w:rFonts w:ascii="Arial" w:cs="Arial" w:eastAsia="Arial" w:hAnsi="Arial"/>
+          <w:b w:val="false"/>
+          <w:bCs w:val="false"/>
+          <w:color w:val="334155"/>
+          <w:sz w:val="22"/>
+          <w:szCs w:val="22"/>
+        </w:rPr>
+        <w:t xml:space="preserve">Defense (Project Partner): "We implemented Separate Chaining. Our table initializes with a prime bucket size of 23 to minimize harmonic clustering. We hash string keys using the polynomial djb2 algorithm (hash = ((hash &lt;&lt; 5) + hash) + charCode). When two keys map to the same bucket index, they are chained together in a singly linked list. Lookups, insertions, and deletions run in O(1) average time."</w:t>
+      </w:r>
+    </w:p>
+    <w:p>
+      <w:pPr>
+        <w:spacing w:after="120" w:before="0"/>
+        <w:jc w:val="left"/>
+      </w:pPr>
+      <w:r>
+        <w:rPr>
+          <w:rFonts w:ascii="Arial" w:cs="Arial" w:eastAsia="Arial" w:hAnsi="Arial"/>
+          <w:b/>
+          <w:bCs/>
+          <w:color w:val="0F172A"/>
+          <w:sz w:val="22"/>
+          <w:szCs w:val="22"/>
+        </w:rPr>
+        <w:t xml:space="preserve">Q3: What happens inside your MaxHeap when a track play count increments?</w:t>
+      </w:r>
+    </w:p>
+    <w:p>
+      <w:pPr>
+        <w:spacing w:after="120" w:before="0"/>
+        <w:jc w:val="left"/>
+      </w:pPr>
+      <w:r>
+        <w:rPr>
+          <w:rFonts w:ascii="Arial" w:cs="Arial" w:eastAsia="Arial" w:hAnsi="Arial"/>
+          <w:b w:val="false"/>
+          <w:bCs w:val="false"/>
+          <w:color w:val="334155"/>
+          <w:sz w:val="22"/>
+          <w:szCs w:val="22"/>
+        </w:rPr>
+        <w:t xml:space="preserve">Defense (Project Partner): "Our Max-Heap is an array-backed complete binary tree where parent index is Math.floor((i - 1) / 2). When a song plays, we increment its playCount and call siftUp(index). The algorithm repeatedly compares the child's playCount with its parent's and swaps them until the max-heap invariant (parent.playCount &gt;= child.playCount) is satisfied. This executes in strictly O(log N) time, avoiding an O(N log N) full sort."</w:t>
+      </w:r>
+    </w:p>
+    <w:p>
+      <w:pPr>
+        <w:spacing w:after="120" w:before="0"/>
+        <w:jc w:val="left"/>
+      </w:pPr>
+      <w:r>
+        <w:rPr>
+          <w:rFonts w:ascii="Arial" w:cs="Arial" w:eastAsia="Arial" w:hAnsi="Arial"/>
+          <w:b/>
+          <w:bCs/>
+          <w:color w:val="0F172A"/>
+          <w:sz w:val="22"/>
+          <w:szCs w:val="22"/>
+        </w:rPr>
+        <w:t xml:space="preserve">Q4: Why use a Trie for search instead of a database LIKE query or filter scan?</w:t>
+      </w:r>
+    </w:p>
+    <w:p>
+      <w:pPr>
+        <w:spacing w:after="120" w:before="0"/>
+        <w:jc w:val="left"/>
+      </w:pPr>
+      <w:r>
+        <w:rPr>
+          <w:rFonts w:ascii="Arial" w:cs="Arial" w:eastAsia="Arial" w:hAnsi="Arial"/>
+          <w:b w:val="false"/>
+          <w:bCs w:val="false"/>
+          <w:color w:val="334155"/>
+          <w:sz w:val="22"/>
+          <w:szCs w:val="22"/>
+        </w:rPr>
+        <w:t xml:space="preserve">Defense (Swarup Linge): "A linear array filter or SQL LIKE scan must perform character comparisons across every record in the catalog (O(N * M)). A Trie organizes strings into a character tree. Searching for a prefix of length L takes strictly O(L) time because we only traverse L node links. For a 4-letter query like 'algo', it takes exactly 4 pointer traversals regardless of whether our catalog contains 10 songs or 10 million songs."</w:t>
+      </w:r>
+    </w:p>
+    <w:p>
+      <w:pPr>
+        <w:spacing w:after="120" w:before="0"/>
+        <w:jc w:val="left"/>
+      </w:pPr>
+      <w:r>
+        <w:rPr>
+          <w:rFonts w:ascii="Arial" w:cs="Arial" w:eastAsia="Arial" w:hAnsi="Arial"/>
+          <w:b/>
+          <w:bCs/>
+          <w:color w:val="0F172A"/>
+          <w:sz w:val="22"/>
+          <w:szCs w:val="22"/>
+        </w:rPr>
+        <w:t xml:space="preserve">Q5: What is the difference between your QuickSort and MergeSort implementations?</w:t>
+      </w:r>
+    </w:p>
+    <w:p>
+      <w:pPr>
+        <w:spacing w:after="120" w:before="0"/>
+        <w:jc w:val="left"/>
+      </w:pPr>
+      <w:r>
+        <w:rPr>
+          <w:rFonts w:ascii="Arial" w:cs="Arial" w:eastAsia="Arial" w:hAnsi="Arial"/>
+          <w:b w:val="false"/>
+          <w:bCs w:val="false"/>
+          <w:color w:val="334155"/>
+          <w:sz w:val="22"/>
+          <w:szCs w:val="22"/>
+        </w:rPr>
+        <w:t xml:space="preserve">Defense (Swarup Linge): "QuickSort uses the in-place Lomuto partitioning scheme, selecting the last element as the pivot. It achieves an average time complexity of O(N log N) with O(log N) auxiliary call-stack space. MergeSort, on the other hand, is a divide-and-conquer algorithm that is guaranteed to run in O(N log N) even in the worst case, and it is stable (preserving original order of songs with identical durations), though it requires O(N) temporary auxiliary storage."</w:t>
+      </w:r>
+    </w:p>
+    <w:p>
+      <w:pPr>
+        <w:spacing w:after="120" w:before="0"/>
+        <w:jc w:val="left"/>
+      </w:pPr>
+      <w:r>
+        <w:rPr>
+          <w:rFonts w:ascii="Arial" w:cs="Arial" w:eastAsia="Arial" w:hAnsi="Arial"/>
+          <w:b/>
+          <w:bCs/>
+          <w:color w:val="0F172A"/>
+          <w:sz w:val="22"/>
+          <w:szCs w:val="22"/>
+        </w:rPr>
+        <w:t xml:space="preserve">Q6: Why did you use Breadth-First Search (BFS) instead of Depth-First Search (DFS) for recommendations?</w:t>
+      </w:r>
+    </w:p>
+    <w:p>
+      <w:pPr>
+        <w:spacing w:after="120" w:before="0"/>
+        <w:jc w:val="left"/>
+      </w:pPr>
+      <w:r>
+        <w:rPr>
+          <w:rFonts w:ascii="Arial" w:cs="Arial" w:eastAsia="Arial" w:hAnsi="Arial"/>
+          <w:b w:val="false"/>
+          <w:bCs w:val="false"/>
+          <w:color w:val="334155"/>
+          <w:sz w:val="22"/>
+          <w:szCs w:val="22"/>
+        </w:rPr>
+        <w:t xml:space="preserve">Defense (Project Partner): "BFS traverses level-by-level outward from the source node using a FIFO Queue. In a music similarity graph, immediate neighbors (1 hop) share the exact genre and tempo, while 2-hop neighbors share secondary traits. Depth-First Search would dive deeply down a single genre branch rather than finding the closest acoustic matches. BFS up to depth 2 guarantees the most relevant, tightly coupled recommendations in O(V + E) time."</w:t>
+      </w:r>
+    </w:p>
+    <w:p>
+      <w:pPr>
+        <w:spacing w:after="120" w:before="0"/>
+        <w:jc w:val="left"/>
+      </w:pPr>
+      <w:r>
+        <w:rPr>
+          <w:rFonts w:ascii="Arial" w:cs="Arial" w:eastAsia="Arial" w:hAnsi="Arial"/>
+          <w:b/>
+          <w:bCs/>
+          <w:color w:val="0F172A"/>
+          <w:sz w:val="22"/>
+          <w:szCs w:val="22"/>
+        </w:rPr>
+        <w:t xml:space="preserve">Q7: How does your Undo engine work without consuming excessive memory?</w:t>
+      </w:r>
+    </w:p>
+    <w:p>
+      <w:pPr>
+        <w:spacing w:after="120" w:before="0"/>
+        <w:jc w:val="left"/>
+      </w:pPr>
+      <w:r>
+        <w:rPr>
+          <w:rFonts w:ascii="Arial" w:cs="Arial" w:eastAsia="Arial" w:hAnsi="Arial"/>
+          <w:b w:val="false"/>
+          <w:bCs w:val="false"/>
+          <w:color w:val="334155"/>
+          <w:sz w:val="22"/>
+          <w:szCs w:val="22"/>
+        </w:rPr>
+        <w:t xml:space="preserve">Defense (Swarup Linge): "We implemented the Command Pattern using a LIFO Stack. Instead of saving full copies of the entire playlist array on every action (which would consume O(N * K) memory), we only store the inverse delta command and node reference: { type: 'DELETE_SONG', payload: { song, index } }. Each stack entry consumes only a few bytes. When popped, DoublyLinkedList.insertAt(index, song) executes in O(k) to stitch the node back into place."</w:t>
+      </w:r>
+    </w:p>
+    <w:p>
+      <w:pPr>
+        <w:spacing w:after="120" w:before="0"/>
+        <w:jc w:val="left"/>
+      </w:pPr>
+      <w:r>
+        <w:rPr>
+          <w:rFonts w:ascii="Arial" w:cs="Arial" w:eastAsia="Arial" w:hAnsi="Arial"/>
+          <w:b/>
+          <w:bCs/>
+          <w:color w:val="0F172A"/>
+          <w:sz w:val="22"/>
+          <w:szCs w:val="22"/>
+        </w:rPr>
+        <w:t xml:space="preserve">Q8: How does the custom audio upload work without uploading to a server?</w:t>
+      </w:r>
+    </w:p>
+    <w:p>
+      <w:pPr>
+        <w:spacing w:after="120" w:before="0"/>
+        <w:jc w:val="left"/>
+      </w:pPr>
+      <w:r>
+        <w:rPr>
+          <w:rFonts w:ascii="Arial" w:cs="Arial" w:eastAsia="Arial" w:hAnsi="Arial"/>
+          <w:b w:val="false"/>
+          <w:bCs w:val="false"/>
+          <w:color w:val="334155"/>
+          <w:sz w:val="22"/>
+          <w:szCs w:val="22"/>
+        </w:rPr>
+        <w:t xml:space="preserve">Defense (Project Partner): "We utilize the HTML5 File API and URL.createObjectURL(file). This creates a native, zero-latency browser blob pointer in local memory referencing the audio stream. We asynchronously read the file metadata, construct our Song object, and inject it into all 8 data structures in memory. This eliminates all network latency, cloud storage costs, and CORS issues."</w:t>
+      </w:r>
+    </w:p>
+    <w:p>
+      <w:pPr>
+        <w:spacing w:after="120" w:before="0"/>
+        <w:jc w:val="left"/>
+      </w:pPr>
+      <w:r>
+        <w:rPr>
+          <w:rFonts w:ascii="Arial" w:cs="Arial" w:eastAsia="Arial" w:hAnsi="Arial"/>
+          <w:b/>
+          <w:bCs/>
+          <w:color w:val="0F172A"/>
+          <w:sz w:val="22"/>
+          <w:szCs w:val="22"/>
+        </w:rPr>
+        <w:t xml:space="preserve">Q9: Why is there a Web Audio API Synth fallback in your AudioEngine?</w:t>
+      </w:r>
+    </w:p>
+    <w:p>
+      <w:pPr>
+        <w:spacing w:after="120" w:before="0"/>
+        <w:jc w:val="left"/>
+      </w:pPr>
+      <w:r>
+        <w:rPr>
+          <w:rFonts w:ascii="Arial" w:cs="Arial" w:eastAsia="Arial" w:hAnsi="Arial"/>
+          <w:b w:val="false"/>
+          <w:bCs w:val="false"/>
+          <w:color w:val="334155"/>
+          <w:sz w:val="22"/>
+          <w:szCs w:val="22"/>
+        </w:rPr>
+        <w:t xml:space="preserve">Defense (Swarup Linge): "In real-world web environments, HTML5 Audio can be blocked by browser autoplay policies, missing codecs, or network drops. If our AudioElement throws an error, our engine catches it and seamlessly falls back to a Web Audio API Oscillator node connected to a Gain node, synthesizing melodic arpeggios in real-time so the user experience never breaks."</w:t>
+      </w:r>
+    </w:p>
+    <w:p>
+      <w:pPr>
+        <w:spacing w:after="120" w:before="0"/>
+        <w:jc w:val="left"/>
+      </w:pPr>
+      <w:r>
+        <w:rPr>
+          <w:rFonts w:ascii="Arial" w:cs="Arial" w:eastAsia="Arial" w:hAnsi="Arial"/>
+          <w:b/>
+          <w:bCs/>
+          <w:color w:val="0F172A"/>
+          <w:sz w:val="22"/>
+          <w:szCs w:val="22"/>
+        </w:rPr>
+        <w:t xml:space="preserve">Q10: How does React state coordinate with your custom DSA class instances without losing data on re-renders?</w:t>
+      </w:r>
+    </w:p>
+    <w:p>
+      <w:pPr>
+        <w:spacing w:after="120" w:before="0"/>
+        <w:jc w:val="left"/>
+      </w:pPr>
+      <w:r>
+        <w:rPr>
+          <w:rFonts w:ascii="Arial" w:cs="Arial" w:eastAsia="Arial" w:hAnsi="Arial"/>
+          <w:b w:val="false"/>
+          <w:bCs w:val="false"/>
+          <w:color w:val="334155"/>
+          <w:sz w:val="22"/>
+          <w:szCs w:val="22"/>
+        </w:rPr>
+        <w:t xml:space="preserve">Defense (Swarup Linge): "In MusicPlayerContext.tsx, we store our custom DSA class instances inside React useRef hooks (dllRef, trieRef, heapRef, graphRef, etc.). Unlike useState, useRef values persist across component re-renders without re-instantiating the class or triggering garbage collection. We only call React setState snapshots when structural mutations occur, keeping the UI reactive while the underlying algorithmic engine remains pure and persistent."</w:t>
+      </w:r>
+    </w:p>
+    <w:p>
+      <w:pPr>
+        <w:pStyle w:val="Heading2"/>
+        <w:spacing w:after="140" w:before="260"/>
+      </w:pPr>
+      <w:r>
+        <w:rPr>
+          <w:rFonts w:ascii="Arial" w:cs="Arial" w:eastAsia="Arial" w:hAnsi="Arial"/>
+          <w:b/>
+          <w:bCs/>
+          <w:color w:val="0F172A"/>
+          <w:sz w:val="26"/>
+          <w:szCs w:val="26"/>
+        </w:rPr>
+        <w:t xml:space="preserve">3.5 Evaluation Summary &amp; Self-Assessment</w:t>
+      </w:r>
+    </w:p>
+    <w:p>
+      <w:pPr>
+        <w:spacing w:after="120" w:before="0"/>
+        <w:jc w:val="left"/>
+      </w:pPr>
+      <w:r>
+        <w:rPr>
+          <w:rFonts w:ascii="Arial" w:cs="Arial" w:eastAsia="Arial" w:hAnsi="Arial"/>
+          <w:b w:val="false"/>
+          <w:bCs w:val="false"/>
+          <w:color w:val="334155"/>
+          <w:sz w:val="22"/>
+          <w:szCs w:val="22"/>
+        </w:rPr>
+        <w:t xml:space="preserve">The demonstration video and technical presentation comprehensively verify that our collaborative project Rhythm Box successfully fulfills all academic, algorithmic, and software engineering criteria for the CS-302 laboratory project. All 8 custom data structures operate harmoniously without regression, producing a responsive, educational, and mathematically rigorous music player.</w:t>
       </w:r>
     </w:p>
     <w:p>

</xml_diff>

<commit_message>
docs: add ultra-fast 2-3 minute rapid viva demo script to docx report and markdown
</commit_message>
<xml_diff>
--- a/DSA_Spotify_Project_Report.docx
+++ b/DSA_Spotify_Project_Report.docx
@@ -7972,7 +7972,7 @@
           <w:sz w:val="26"/>
           <w:szCs w:val="26"/>
         </w:rPr>
-        <w:t xml:space="preserve">3.2 Chronological Video Script &amp; Timestamp Log</w:t>
+        <w:t xml:space="preserve">3.2 Ultra-Fast 2 to 3 Minute Live Meeting Script (Rapid Demo)</w:t>
       </w:r>
     </w:p>
     <w:p>
@@ -7989,7 +7989,643 @@
           <w:sz w:val="22"/>
           <w:szCs w:val="22"/>
         </w:rPr>
-        <w:t xml:space="preserve">The presentation video strictly follows a structured 7-minute chronological script, with duties divided equally between both candidates to demonstrate each custom data structure live inside the running application:</w:t>
+        <w:t xml:space="preserve">Designed specifically for accelerated viva examinations and brief 2 to 3 minute faculty reviews. Delivers high-density technical proof across all 8 custom DSA structures in under 150 seconds:</w:t>
+      </w:r>
+    </w:p>
+    <w:p>
+      <w:pPr>
+        <w:pStyle w:val="Heading3"/>
+        <w:spacing w:after="100" w:before="180"/>
+      </w:pPr>
+      <w:r>
+        <w:rPr>
+          <w:rFonts w:ascii="Arial" w:cs="Arial" w:eastAsia="Arial" w:hAnsi="Arial"/>
+          <w:b/>
+          <w:bCs/>
+          <w:color w:val="15803D"/>
+          <w:sz w:val="22"/>
+          <w:szCs w:val="22"/>
+        </w:rPr>
+        <w:t xml:space="preserve">Segment 1: Hook &amp; Core Mandate (00:00 - 00:25) [25s]</w:t>
+      </w:r>
+    </w:p>
+    <w:p>
+      <w:pPr>
+        <w:spacing w:after="80" w:before="80"/>
+      </w:pPr>
+      <w:r>
+        <w:rPr>
+          <w:rFonts w:ascii="Arial" w:cs="Arial" w:eastAsia="Arial" w:hAnsi="Arial"/>
+          <w:b/>
+          <w:bCs/>
+          <w:color w:val="64748B"/>
+          <w:sz w:val="20"/>
+          <w:szCs w:val="20"/>
+        </w:rPr>
+        <w:t xml:space="preserve">▶ [Live Screen Action]: </w:t>
+      </w:r>
+      <w:r>
+        <w:rPr>
+          <w:rFonts w:ascii="Arial" w:cs="Arial" w:eastAsia="Arial" w:hAnsi="Arial"/>
+          <w:color w:val="64748B"/>
+          <w:sz w:val="20"/>
+          <w:szCs w:val="20"/>
+        </w:rPr>
+        <w:t xml:space="preserve">Share screen displaying Rhythm Box at http://localhost:5173. Point to spinning vinyl, dark theme, and telemetry HUD.</w:t>
+      </w:r>
+    </w:p>
+    <w:p>
+      <w:pPr>
+        <w:spacing w:after="120" w:before="100"/>
+      </w:pPr>
+      <w:r>
+        <w:rPr>
+          <w:rFonts w:ascii="Arial" w:cs="Arial" w:eastAsia="Arial" w:hAnsi="Arial"/>
+          <w:b/>
+          <w:bCs/>
+          <w:color w:val="0F5132"/>
+          <w:sz w:val="21"/>
+          <w:szCs w:val="21"/>
+        </w:rPr>
+        <w:t xml:space="preserve">[Swarup Linge]: </w:t>
+      </w:r>
+      <w:r>
+        <w:rPr>
+          <w:rFonts w:ascii="Arial" w:cs="Arial" w:eastAsia="Arial" w:hAnsi="Arial"/>
+          <w:color w:val="0F172A"/>
+          <w:sz w:val="21"/>
+          <w:szCs w:val="21"/>
+        </w:rPr>
+        <w:t xml:space="preserve">"Good morning / afternoon, sir! I am Swarup Linge (Roll No: 24), and this is my project partner [Friend's Name]. Today we present Rhythm Box—a Spotify-inspired music platform where every core feature is powered by custom Data Structures &amp; Algorithms without using native array shortcuts."</w:t>
+      </w:r>
+    </w:p>
+    <w:p>
+      <w:pPr>
+        <w:spacing w:after="120" w:before="100"/>
+      </w:pPr>
+      <w:r>
+        <w:rPr>
+          <w:rFonts w:ascii="Arial" w:cs="Arial" w:eastAsia="Arial" w:hAnsi="Arial"/>
+          <w:b/>
+          <w:bCs/>
+          <w:color w:val="15803D"/>
+          <w:sz w:val="21"/>
+          <w:szCs w:val="21"/>
+        </w:rPr>
+        <w:t xml:space="preserve">[Project Partner]: </w:t>
+      </w:r>
+      <w:r>
+        <w:rPr>
+          <w:rFonts w:ascii="Arial" w:cs="Arial" w:eastAsia="Arial" w:hAnsi="Arial"/>
+          <w:color w:val="0F172A"/>
+          <w:sz w:val="21"/>
+          <w:szCs w:val="21"/>
+        </w:rPr>
+        <w:t xml:space="preserve">"In standard web apps, naive array operations like shift() or linear search cause an O(N) lag. In Rhythm Box, we built 8 custom DSA classes from first principles in pure TypeScript to achieve optimal O(1), O(L), and O(log N) performance."</w:t>
+      </w:r>
+    </w:p>
+    <w:p>
+      <w:pPr>
+        <w:pStyle w:val="Heading3"/>
+        <w:spacing w:after="100" w:before="180"/>
+      </w:pPr>
+      <w:r>
+        <w:rPr>
+          <w:rFonts w:ascii="Arial" w:cs="Arial" w:eastAsia="Arial" w:hAnsi="Arial"/>
+          <w:b/>
+          <w:bCs/>
+          <w:color w:val="15803D"/>
+          <w:sz w:val="22"/>
+          <w:szCs w:val="22"/>
+        </w:rPr>
+        <w:t xml:space="preserve">Segment 2: Traversal &amp; Up Next Queue (00:25 - 00:55) [30s]</w:t>
+      </w:r>
+    </w:p>
+    <w:p>
+      <w:pPr>
+        <w:spacing w:after="80" w:before="80"/>
+      </w:pPr>
+      <w:r>
+        <w:rPr>
+          <w:rFonts w:ascii="Arial" w:cs="Arial" w:eastAsia="Arial" w:hAnsi="Arial"/>
+          <w:b/>
+          <w:bCs/>
+          <w:color w:val="64748B"/>
+          <w:sz w:val="20"/>
+          <w:szCs w:val="20"/>
+        </w:rPr>
+        <w:t xml:space="preserve">▶ [Live Screen Action]: </w:t>
+      </w:r>
+      <w:r>
+        <w:rPr>
+          <w:rFonts w:ascii="Arial" w:cs="Arial" w:eastAsia="Arial" w:hAnsi="Arial"/>
+          <w:color w:val="64748B"/>
+          <w:sz w:val="20"/>
+          <w:szCs w:val="20"/>
+        </w:rPr>
+        <w:t xml:space="preserve">Swarup clicks Next Track button and points to the live DLL Pointer HUD.</w:t>
+      </w:r>
+    </w:p>
+    <w:p>
+      <w:pPr>
+        <w:spacing w:after="120" w:before="100"/>
+      </w:pPr>
+      <w:r>
+        <w:rPr>
+          <w:rFonts w:ascii="Arial" w:cs="Arial" w:eastAsia="Arial" w:hAnsi="Arial"/>
+          <w:b/>
+          <w:bCs/>
+          <w:color w:val="0F5132"/>
+          <w:sz w:val="21"/>
+          <w:szCs w:val="21"/>
+        </w:rPr>
+        <w:t xml:space="preserve">[Swarup Linge]: </w:t>
+      </w:r>
+      <w:r>
+        <w:rPr>
+          <w:rFonts w:ascii="Arial" w:cs="Arial" w:eastAsia="Arial" w:hAnsi="Arial"/>
+          <w:color w:val="0F172A"/>
+          <w:sz w:val="21"/>
+          <w:szCs w:val="21"/>
+        </w:rPr>
+        <w:t xml:space="preserve">"First, playlist navigation: In DoublyLinkedList.ts, our SongNode holds explicit prev and next pointers. When I click Next, it dereferences current.next in strictly O(1) time—no array scanning, zero lag, as verified in our live HUD."</w:t>
+      </w:r>
+    </w:p>
+    <w:p>
+      <w:pPr>
+        <w:spacing w:after="80" w:before="80"/>
+      </w:pPr>
+      <w:r>
+        <w:rPr>
+          <w:rFonts w:ascii="Arial" w:cs="Arial" w:eastAsia="Arial" w:hAnsi="Arial"/>
+          <w:b/>
+          <w:bCs/>
+          <w:color w:val="64748B"/>
+          <w:sz w:val="20"/>
+          <w:szCs w:val="20"/>
+        </w:rPr>
+        <w:t xml:space="preserve">▶ [Live Screen Action]: </w:t>
+      </w:r>
+      <w:r>
+        <w:rPr>
+          <w:rFonts w:ascii="Arial" w:cs="Arial" w:eastAsia="Arial" w:hAnsi="Arial"/>
+          <w:color w:val="64748B"/>
+          <w:sz w:val="20"/>
+          <w:szCs w:val="20"/>
+        </w:rPr>
+        <w:t xml:space="preserve">Partner clicks Add to Queue on 2 songs and opens the Up Next drawer.</w:t>
+      </w:r>
+    </w:p>
+    <w:p>
+      <w:pPr>
+        <w:spacing w:after="120" w:before="100"/>
+      </w:pPr>
+      <w:r>
+        <w:rPr>
+          <w:rFonts w:ascii="Arial" w:cs="Arial" w:eastAsia="Arial" w:hAnsi="Arial"/>
+          <w:b/>
+          <w:bCs/>
+          <w:color w:val="15803D"/>
+          <w:sz w:val="21"/>
+          <w:szCs w:val="21"/>
+        </w:rPr>
+        <w:t xml:space="preserve">[Project Partner]: </w:t>
+      </w:r>
+      <w:r>
+        <w:rPr>
+          <w:rFonts w:ascii="Arial" w:cs="Arial" w:eastAsia="Arial" w:hAnsi="Arial"/>
+          <w:color w:val="0F172A"/>
+          <w:sz w:val="21"/>
+          <w:szCs w:val="21"/>
+        </w:rPr>
+        <w:t xml:space="preserve">"Second, our Up Next FIFO Queue in Queue.ts. It has explicit head and tail pointers. Enqueuing runs in O(1), and when a song ends, the queue automatically dequeues before the playlist resumes."</w:t>
+      </w:r>
+    </w:p>
+    <w:p>
+      <w:pPr>
+        <w:pStyle w:val="Heading3"/>
+        <w:spacing w:after="100" w:before="180"/>
+      </w:pPr>
+      <w:r>
+        <w:rPr>
+          <w:rFonts w:ascii="Arial" w:cs="Arial" w:eastAsia="Arial" w:hAnsi="Arial"/>
+          <w:b/>
+          <w:bCs/>
+          <w:color w:val="15803D"/>
+          <w:sz w:val="22"/>
+          <w:szCs w:val="22"/>
+        </w:rPr>
+        <w:t xml:space="preserve">Segment 3: Instant Search &amp; Favorites (00:55 - 01:25) [30s]</w:t>
+      </w:r>
+    </w:p>
+    <w:p>
+      <w:pPr>
+        <w:spacing w:after="80" w:before="80"/>
+      </w:pPr>
+      <w:r>
+        <w:rPr>
+          <w:rFonts w:ascii="Arial" w:cs="Arial" w:eastAsia="Arial" w:hAnsi="Arial"/>
+          <w:b/>
+          <w:bCs/>
+          <w:color w:val="64748B"/>
+          <w:sz w:val="20"/>
+          <w:szCs w:val="20"/>
+        </w:rPr>
+        <w:t xml:space="preserve">▶ [Live Screen Action]: </w:t>
+      </w:r>
+      <w:r>
+        <w:rPr>
+          <w:rFonts w:ascii="Arial" w:cs="Arial" w:eastAsia="Arial" w:hAnsi="Arial"/>
+          <w:color w:val="64748B"/>
+          <w:sz w:val="20"/>
+          <w:szCs w:val="20"/>
+        </w:rPr>
+        <w:t xml:space="preserve">Swarup clicks Search bar and types "a-l-g-o".</w:t>
+      </w:r>
+    </w:p>
+    <w:p>
+      <w:pPr>
+        <w:spacing w:after="120" w:before="100"/>
+      </w:pPr>
+      <w:r>
+        <w:rPr>
+          <w:rFonts w:ascii="Arial" w:cs="Arial" w:eastAsia="Arial" w:hAnsi="Arial"/>
+          <w:b/>
+          <w:bCs/>
+          <w:color w:val="0F5132"/>
+          <w:sz w:val="21"/>
+          <w:szCs w:val="21"/>
+        </w:rPr>
+        <w:t xml:space="preserve">[Swarup Linge]: </w:t>
+      </w:r>
+      <w:r>
+        <w:rPr>
+          <w:rFonts w:ascii="Arial" w:cs="Arial" w:eastAsia="Arial" w:hAnsi="Arial"/>
+          <w:color w:val="0F172A"/>
+          <w:sz w:val="21"/>
+          <w:szCs w:val="21"/>
+        </w:rPr>
+        <w:t xml:space="preserve">"Third, instant search: In Trie.ts, we engineered a 26-ary character Prefix Tree. As I type "algo", notice the response time badge: 0.3 milliseconds! Because it traverses in strictly O(L) time (L = query length), completely independent of catalog size."</w:t>
+      </w:r>
+    </w:p>
+    <w:p>
+      <w:pPr>
+        <w:spacing w:after="80" w:before="80"/>
+      </w:pPr>
+      <w:r>
+        <w:rPr>
+          <w:rFonts w:ascii="Arial" w:cs="Arial" w:eastAsia="Arial" w:hAnsi="Arial"/>
+          <w:b/>
+          <w:bCs/>
+          <w:color w:val="64748B"/>
+          <w:sz w:val="20"/>
+          <w:szCs w:val="20"/>
+        </w:rPr>
+        <w:t xml:space="preserve">▶ [Live Screen Action]: </w:t>
+      </w:r>
+      <w:r>
+        <w:rPr>
+          <w:rFonts w:ascii="Arial" w:cs="Arial" w:eastAsia="Arial" w:hAnsi="Arial"/>
+          <w:color w:val="64748B"/>
+          <w:sz w:val="20"/>
+          <w:szCs w:val="20"/>
+        </w:rPr>
+        <w:t xml:space="preserve">Partner clicks the heart icon on 2 tracks in the table.</w:t>
+      </w:r>
+    </w:p>
+    <w:p>
+      <w:pPr>
+        <w:spacing w:after="120" w:before="100"/>
+      </w:pPr>
+      <w:r>
+        <w:rPr>
+          <w:rFonts w:ascii="Arial" w:cs="Arial" w:eastAsia="Arial" w:hAnsi="Arial"/>
+          <w:b/>
+          <w:bCs/>
+          <w:color w:val="15803D"/>
+          <w:sz w:val="21"/>
+          <w:szCs w:val="21"/>
+        </w:rPr>
+        <w:t xml:space="preserve">[Project Partner]: </w:t>
+      </w:r>
+      <w:r>
+        <w:rPr>
+          <w:rFonts w:ascii="Arial" w:cs="Arial" w:eastAsia="Arial" w:hAnsi="Arial"/>
+          <w:color w:val="0F172A"/>
+          <w:sz w:val="21"/>
+          <w:szCs w:val="21"/>
+        </w:rPr>
+        <w:t xml:space="preserve">"Fourth, Favorites: In CustomHashMap.ts, we built our own Hash Table using the polynomial djb2 hash algorithm with separate chaining. Toggling favorites and metadata lookups takes strictly O(1) average time."</w:t>
+      </w:r>
+    </w:p>
+    <w:p>
+      <w:pPr>
+        <w:pStyle w:val="Heading3"/>
+        <w:spacing w:after="100" w:before="180"/>
+      </w:pPr>
+      <w:r>
+        <w:rPr>
+          <w:rFonts w:ascii="Arial" w:cs="Arial" w:eastAsia="Arial" w:hAnsi="Arial"/>
+          <w:b/>
+          <w:bCs/>
+          <w:color w:val="15803D"/>
+          <w:sz w:val="22"/>
+          <w:szCs w:val="22"/>
+        </w:rPr>
+        <w:t xml:space="preserve">Segment 4: Dynamic Charts, Sorting &amp; Recommendations (01:25 - 01:55) [30s]</w:t>
+      </w:r>
+    </w:p>
+    <w:p>
+      <w:pPr>
+        <w:spacing w:after="80" w:before="80"/>
+      </w:pPr>
+      <w:r>
+        <w:rPr>
+          <w:rFonts w:ascii="Arial" w:cs="Arial" w:eastAsia="Arial" w:hAnsi="Arial"/>
+          <w:b/>
+          <w:bCs/>
+          <w:color w:val="64748B"/>
+          <w:sz w:val="20"/>
+          <w:szCs w:val="20"/>
+        </w:rPr>
+        <w:t xml:space="preserve">▶ [Live Screen Action]: </w:t>
+      </w:r>
+      <w:r>
+        <w:rPr>
+          <w:rFonts w:ascii="Arial" w:cs="Arial" w:eastAsia="Arial" w:hAnsi="Arial"/>
+          <w:color w:val="64748B"/>
+          <w:sz w:val="20"/>
+          <w:szCs w:val="20"/>
+        </w:rPr>
+        <w:t xml:space="preserve">Partner clicks play on track 4 twice, pointing to the Top Charts shelf.</w:t>
+      </w:r>
+    </w:p>
+    <w:p>
+      <w:pPr>
+        <w:spacing w:after="120" w:before="100"/>
+      </w:pPr>
+      <w:r>
+        <w:rPr>
+          <w:rFonts w:ascii="Arial" w:cs="Arial" w:eastAsia="Arial" w:hAnsi="Arial"/>
+          <w:b/>
+          <w:bCs/>
+          <w:color w:val="15803D"/>
+          <w:sz w:val="21"/>
+          <w:szCs w:val="21"/>
+        </w:rPr>
+        <w:t xml:space="preserve">[Project Partner]: </w:t>
+      </w:r>
+      <w:r>
+        <w:rPr>
+          <w:rFonts w:ascii="Arial" w:cs="Arial" w:eastAsia="Arial" w:hAnsi="Arial"/>
+          <w:color w:val="0F172A"/>
+          <w:sz w:val="21"/>
+          <w:szCs w:val="21"/>
+        </w:rPr>
+        <w:t xml:space="preserve">"Fifth, trending analytics: In MaxHeap.ts, a Binary Max-Heap keyed on playCount executes siftUp() in O(log N) time, automatically bubbling played tracks into the Top Charts without re-sorting the catalog! Sixth, for library sorting, we implemented custom in-place QuickSort and MergeSort in O(N log N)."</w:t>
+      </w:r>
+    </w:p>
+    <w:p>
+      <w:pPr>
+        <w:spacing w:after="80" w:before="80"/>
+      </w:pPr>
+      <w:r>
+        <w:rPr>
+          <w:rFonts w:ascii="Arial" w:cs="Arial" w:eastAsia="Arial" w:hAnsi="Arial"/>
+          <w:b/>
+          <w:bCs/>
+          <w:color w:val="64748B"/>
+          <w:sz w:val="20"/>
+          <w:szCs w:val="20"/>
+        </w:rPr>
+        <w:t xml:space="preserve">▶ [Live Screen Action]: </w:t>
+      </w:r>
+      <w:r>
+        <w:rPr>
+          <w:rFonts w:ascii="Arial" w:cs="Arial" w:eastAsia="Arial" w:hAnsi="Arial"/>
+          <w:color w:val="64748B"/>
+          <w:sz w:val="20"/>
+          <w:szCs w:val="20"/>
+        </w:rPr>
+        <w:t xml:space="preserve">Swarup clicks Show Song Relationship Graph.</w:t>
+      </w:r>
+    </w:p>
+    <w:p>
+      <w:pPr>
+        <w:spacing w:after="120" w:before="100"/>
+      </w:pPr>
+      <w:r>
+        <w:rPr>
+          <w:rFonts w:ascii="Arial" w:cs="Arial" w:eastAsia="Arial" w:hAnsi="Arial"/>
+          <w:b/>
+          <w:bCs/>
+          <w:color w:val="0F5132"/>
+          <w:sz w:val="21"/>
+          <w:szCs w:val="21"/>
+        </w:rPr>
+        <w:t xml:space="preserve">[Swarup Linge]: </w:t>
+      </w:r>
+      <w:r>
+        <w:rPr>
+          <w:rFonts w:ascii="Arial" w:cs="Arial" w:eastAsia="Arial" w:hAnsi="Arial"/>
+          <w:color w:val="0F172A"/>
+          <w:sz w:val="21"/>
+          <w:szCs w:val="21"/>
+        </w:rPr>
+        <w:t xml:space="preserve">"Seventh, recommendations: In Graph.ts, an Adjacency List Graph connects songs sharing genres and tempo, executing Breadth-First Search (BFS) up to 2 hops of depth in O(V + E) time to populate recommendations."</w:t>
+      </w:r>
+    </w:p>
+    <w:p>
+      <w:pPr>
+        <w:pStyle w:val="Heading3"/>
+        <w:spacing w:after="100" w:before="180"/>
+      </w:pPr>
+      <w:r>
+        <w:rPr>
+          <w:rFonts w:ascii="Arial" w:cs="Arial" w:eastAsia="Arial" w:hAnsi="Arial"/>
+          <w:b/>
+          <w:bCs/>
+          <w:color w:val="15803D"/>
+          <w:sz w:val="22"/>
+          <w:szCs w:val="22"/>
+        </w:rPr>
+        <w:t xml:space="preserve">Segment 5: Showstopper Demo — Custom Audio Ingestion &amp; Undo (01:55 - 02:25) [30s]</w:t>
+      </w:r>
+    </w:p>
+    <w:p>
+      <w:pPr>
+        <w:spacing w:after="80" w:before="80"/>
+      </w:pPr>
+      <w:r>
+        <w:rPr>
+          <w:rFonts w:ascii="Arial" w:cs="Arial" w:eastAsia="Arial" w:hAnsi="Arial"/>
+          <w:b/>
+          <w:bCs/>
+          <w:color w:val="64748B"/>
+          <w:sz w:val="20"/>
+          <w:szCs w:val="20"/>
+        </w:rPr>
+        <w:t xml:space="preserve">▶ [Live Screen Action]: </w:t>
+      </w:r>
+      <w:r>
+        <w:rPr>
+          <w:rFonts w:ascii="Arial" w:cs="Arial" w:eastAsia="Arial" w:hAnsi="Arial"/>
+          <w:color w:val="64748B"/>
+          <w:sz w:val="20"/>
+          <w:szCs w:val="20"/>
+        </w:rPr>
+        <w:t xml:space="preserve">Partner clicks Insert Audio File on Player Deck, selects an MP3 file.</w:t>
+      </w:r>
+    </w:p>
+    <w:p>
+      <w:pPr>
+        <w:spacing w:after="120" w:before="100"/>
+      </w:pPr>
+      <w:r>
+        <w:rPr>
+          <w:rFonts w:ascii="Arial" w:cs="Arial" w:eastAsia="Arial" w:hAnsi="Arial"/>
+          <w:b/>
+          <w:bCs/>
+          <w:color w:val="15803D"/>
+          <w:sz w:val="21"/>
+          <w:szCs w:val="21"/>
+        </w:rPr>
+        <w:t xml:space="preserve">[Project Partner]: </w:t>
+      </w:r>
+      <w:r>
+        <w:rPr>
+          <w:rFonts w:ascii="Arial" w:cs="Arial" w:eastAsia="Arial" w:hAnsi="Arial"/>
+          <w:color w:val="0F172A"/>
+          <w:sz w:val="21"/>
+          <w:szCs w:val="21"/>
+        </w:rPr>
+        <w:t xml:space="preserve">"Now, our showstopper: I will upload a local MP3 file. Watch how it simultaneously propagates into all 8 custom DSA structures in real-time—DLL append O(1), Trie index O(L), HashMap put O(1), MaxHeap insert O(log N), and Graph link—playing immediately with full HTML5 audio!"</w:t>
+      </w:r>
+    </w:p>
+    <w:p>
+      <w:pPr>
+        <w:spacing w:after="80" w:before="80"/>
+      </w:pPr>
+      <w:r>
+        <w:rPr>
+          <w:rFonts w:ascii="Arial" w:cs="Arial" w:eastAsia="Arial" w:hAnsi="Arial"/>
+          <w:b/>
+          <w:bCs/>
+          <w:color w:val="64748B"/>
+          <w:sz w:val="20"/>
+          <w:szCs w:val="20"/>
+        </w:rPr>
+        <w:t xml:space="preserve">▶ [Live Screen Action]: </w:t>
+      </w:r>
+      <w:r>
+        <w:rPr>
+          <w:rFonts w:ascii="Arial" w:cs="Arial" w:eastAsia="Arial" w:hAnsi="Arial"/>
+          <w:color w:val="64748B"/>
+          <w:sz w:val="20"/>
+          <w:szCs w:val="20"/>
+        </w:rPr>
+        <w:t xml:space="preserve">Swarup deletes a song from the table, then clicks Undo Last Action.</w:t>
+      </w:r>
+    </w:p>
+    <w:p>
+      <w:pPr>
+        <w:spacing w:after="120" w:before="100"/>
+      </w:pPr>
+      <w:r>
+        <w:rPr>
+          <w:rFonts w:ascii="Arial" w:cs="Arial" w:eastAsia="Arial" w:hAnsi="Arial"/>
+          <w:b/>
+          <w:bCs/>
+          <w:color w:val="0F5132"/>
+          <w:sz w:val="21"/>
+          <w:szCs w:val="21"/>
+        </w:rPr>
+        <w:t xml:space="preserve">[Swarup Linge]: </w:t>
+      </w:r>
+      <w:r>
+        <w:rPr>
+          <w:rFonts w:ascii="Arial" w:cs="Arial" w:eastAsia="Arial" w:hAnsi="Arial"/>
+          <w:color w:val="0F172A"/>
+          <w:sz w:val="21"/>
+          <w:szCs w:val="21"/>
+        </w:rPr>
+        <w:t xml:space="preserve">"And eighth, our LIFO Undo Engine in Stack.ts stores inverse delta commands, popping in O(1) to restore deleted tracks at their exact original index. All 14 automated test cases passed, and the production build is under 105 KB gzip!"</w:t>
+      </w:r>
+    </w:p>
+    <w:p>
+      <w:pPr>
+        <w:pStyle w:val="Heading3"/>
+        <w:spacing w:after="100" w:before="180"/>
+      </w:pPr>
+      <w:r>
+        <w:rPr>
+          <w:rFonts w:ascii="Arial" w:cs="Arial" w:eastAsia="Arial" w:hAnsi="Arial"/>
+          <w:b/>
+          <w:bCs/>
+          <w:color w:val="15803D"/>
+          <w:sz w:val="22"/>
+          <w:szCs w:val="22"/>
+        </w:rPr>
+        <w:t xml:space="preserve">Segment 6: Concluding Handover (02:25 - 02:35) [10s]</w:t>
+      </w:r>
+    </w:p>
+    <w:p>
+      <w:pPr>
+        <w:spacing w:after="120" w:before="100"/>
+      </w:pPr>
+      <w:r>
+        <w:rPr>
+          <w:rFonts w:ascii="Arial" w:cs="Arial" w:eastAsia="Arial" w:hAnsi="Arial"/>
+          <w:b/>
+          <w:bCs/>
+          <w:color w:val="0F5132"/>
+          <w:sz w:val="21"/>
+          <w:szCs w:val="21"/>
+        </w:rPr>
+        <w:t xml:space="preserve">[Swarup &amp; Partner]: </w:t>
+      </w:r>
+      <w:r>
+        <w:rPr>
+          <w:rFonts w:ascii="Arial" w:cs="Arial" w:eastAsia="Arial" w:hAnsi="Arial"/>
+          <w:color w:val="0F172A"/>
+          <w:sz w:val="21"/>
+          <w:szCs w:val="21"/>
+        </w:rPr>
+        <w:t xml:space="preserve">"In summary, Rhythm Box proves how classical computer science structures power real-world multimedia applications. Thank you, professors! We are now ready for your questions."</w:t>
+      </w:r>
+    </w:p>
+    <w:p>
+      <w:pPr>
+        <w:pStyle w:val="Heading2"/>
+        <w:spacing w:after="140" w:before="260"/>
+      </w:pPr>
+      <w:r>
+        <w:rPr>
+          <w:rFonts w:ascii="Arial" w:cs="Arial" w:eastAsia="Arial" w:hAnsi="Arial"/>
+          <w:b/>
+          <w:bCs/>
+          <w:color w:val="0F172A"/>
+          <w:sz w:val="26"/>
+          <w:szCs w:val="26"/>
+        </w:rPr>
+        <w:t xml:space="preserve">3.3 Detailed 7-Minute Chronological Walkthrough &amp; Timestamp Log</w:t>
+      </w:r>
+    </w:p>
+    <w:p>
+      <w:pPr>
+        <w:spacing w:after="120" w:before="0"/>
+        <w:jc w:val="left"/>
+      </w:pPr>
+      <w:r>
+        <w:rPr>
+          <w:rFonts w:ascii="Arial" w:cs="Arial" w:eastAsia="Arial" w:hAnsi="Arial"/>
+          <w:b w:val="false"/>
+          <w:bCs w:val="false"/>
+          <w:color w:val="334155"/>
+          <w:sz w:val="22"/>
+          <w:szCs w:val="22"/>
+        </w:rPr>
+        <w:t xml:space="preserve">The comprehensive presentation breakdown follows a structured 7-minute chronological script, with duties divided equally between both candidates:</w:t>
       </w:r>
     </w:p>
     <w:tbl>

</xml_diff>